<commit_message>
changes in some test subject experience
</commit_message>
<xml_diff>
--- a/论文初稿.docx
+++ b/论文初稿.docx
@@ -1525,6 +1525,3273 @@
         </w:rPr>
         <w:t>The direction of the memory differences remains partly exploratory. Structural fluency may facilitate processing, whereas emotional or stylistic distinctiveness may strengthen encoding.</w:t>
       </w:r>
+    </w:p>
+    <w:p>
+      <w:pPr>
+        <w:spacing w:before="100" w:beforeAutospacing="1" w:after="100" w:afterAutospacing="1" w:line="360" w:lineRule="auto"/>
+        <w:rPr>
+          <w:rFonts w:ascii="Times New Roman" w:eastAsia="Times New Roman" w:hAnsi="Times New Roman" w:cs="Times New Roman"/>
+          <w:kern w:val="0"/>
+          <w14:ligatures w14:val="none"/>
+        </w:rPr>
+      </w:pPr>
+    </w:p>
+    <w:p>
+      <w:pPr>
+        <w:spacing w:before="100" w:beforeAutospacing="1" w:after="100" w:afterAutospacing="1" w:line="360" w:lineRule="auto"/>
+        <w:outlineLvl w:val="1"/>
+        <w:rPr>
+          <w:rFonts w:ascii="Times New Roman" w:eastAsia="Times New Roman" w:hAnsi="Times New Roman" w:cs="Times New Roman"/>
+          <w:b/>
+          <w:bCs/>
+          <w:kern w:val="0"/>
+          <w:sz w:val="36"/>
+          <w:szCs w:val="36"/>
+          <w14:ligatures w14:val="none"/>
+        </w:rPr>
+      </w:pPr>
+      <w:r>
+        <w:rPr>
+          <w:rFonts w:ascii="Times New Roman" w:eastAsia="Times New Roman" w:hAnsi="Times New Roman" w:cs="Times New Roman"/>
+          <w:b/>
+          <w:bCs/>
+          <w:kern w:val="0"/>
+          <w:sz w:val="36"/>
+          <w:szCs w:val="36"/>
+          <w14:ligatures w14:val="none"/>
+        </w:rPr>
+        <w:t>3. Methodology</w:t>
+      </w:r>
+    </w:p>
+    <w:p>
+      <w:pPr>
+        <w:spacing w:before="100" w:beforeAutospacing="1" w:after="100" w:afterAutospacing="1" w:line="360" w:lineRule="auto"/>
+        <w:outlineLvl w:val="2"/>
+        <w:rPr>
+          <w:rFonts w:ascii="Times New Roman" w:eastAsia="Times New Roman" w:hAnsi="Times New Roman" w:cs="Times New Roman"/>
+          <w:b/>
+          <w:bCs/>
+          <w:kern w:val="0"/>
+          <w:sz w:val="27"/>
+          <w:szCs w:val="27"/>
+          <w14:ligatures w14:val="none"/>
+        </w:rPr>
+      </w:pPr>
+      <w:r>
+        <w:rPr>
+          <w:rFonts w:ascii="Times New Roman" w:eastAsia="Times New Roman" w:hAnsi="Times New Roman" w:cs="Times New Roman"/>
+          <w:b/>
+          <w:bCs/>
+          <w:kern w:val="0"/>
+          <w:sz w:val="27"/>
+          <w:szCs w:val="27"/>
+          <w14:ligatures w14:val="none"/>
+        </w:rPr>
+        <w:t>3.1 Research Design</w:t>
+      </w:r>
+    </w:p>
+    <w:p>
+      <w:pPr>
+        <w:spacing w:before="100" w:beforeAutospacing="1" w:after="100" w:afterAutospacing="1" w:line="360" w:lineRule="auto"/>
+        <w:rPr>
+          <w:rFonts w:ascii="Times New Roman" w:eastAsia="Times New Roman" w:hAnsi="Times New Roman" w:cs="Times New Roman"/>
+          <w:kern w:val="0"/>
+          <w14:ligatures w14:val="none"/>
+        </w:rPr>
+      </w:pPr>
+      <w:r>
+        <w:rPr>
+          <w:rFonts w:ascii="Times New Roman" w:eastAsia="Times New Roman" w:hAnsi="Times New Roman" w:cs="Times New Roman"/>
+          <w:kern w:val="0"/>
+          <w14:ligatures w14:val="none"/>
+        </w:rPr>
+        <w:t>The study uses a web-based repeated-measures design involving three text conditions:</w:t>
+      </w:r>
+    </w:p>
+    <w:p>
+      <w:pPr>
+        <w:numPr>
+          <w:ilvl w:val="0"/>
+          <w:numId w:val="2"/>
+        </w:numPr>
+        <w:spacing w:before="100" w:beforeAutospacing="1" w:after="100" w:afterAutospacing="1" w:line="360" w:lineRule="auto"/>
+        <w:rPr>
+          <w:rFonts w:ascii="Times New Roman" w:eastAsia="Times New Roman" w:hAnsi="Times New Roman" w:cs="Times New Roman"/>
+          <w:kern w:val="0"/>
+          <w14:ligatures w14:val="none"/>
+        </w:rPr>
+      </w:pPr>
+      <w:r>
+        <w:rPr>
+          <w:rFonts w:ascii="Times New Roman" w:eastAsia="Times New Roman" w:hAnsi="Times New Roman" w:cs="Times New Roman"/>
+          <w:kern w:val="0"/>
+          <w14:ligatures w14:val="none"/>
+        </w:rPr>
+        <w:t xml:space="preserve">Human-written; </w:t>
+      </w:r>
+    </w:p>
+    <w:p>
+      <w:pPr>
+        <w:numPr>
+          <w:ilvl w:val="0"/>
+          <w:numId w:val="2"/>
+        </w:numPr>
+        <w:spacing w:before="100" w:beforeAutospacing="1" w:after="100" w:afterAutospacing="1" w:line="360" w:lineRule="auto"/>
+        <w:rPr>
+          <w:rFonts w:ascii="Times New Roman" w:eastAsia="Times New Roman" w:hAnsi="Times New Roman" w:cs="Times New Roman"/>
+          <w:kern w:val="0"/>
+          <w14:ligatures w14:val="none"/>
+        </w:rPr>
+      </w:pPr>
+      <w:r>
+        <w:rPr>
+          <w:rFonts w:ascii="Times New Roman" w:eastAsia="Times New Roman" w:hAnsi="Times New Roman" w:cs="Times New Roman"/>
+          <w:kern w:val="0"/>
+          <w14:ligatures w14:val="none"/>
+        </w:rPr>
+        <w:t xml:space="preserve">AI-generated; </w:t>
+      </w:r>
+    </w:p>
+    <w:p>
+      <w:pPr>
+        <w:numPr>
+          <w:ilvl w:val="0"/>
+          <w:numId w:val="2"/>
+        </w:numPr>
+        <w:spacing w:before="100" w:beforeAutospacing="1" w:after="100" w:afterAutospacing="1" w:line="360" w:lineRule="auto"/>
+        <w:rPr>
+          <w:rFonts w:ascii="Times New Roman" w:eastAsia="Times New Roman" w:hAnsi="Times New Roman" w:cs="Times New Roman"/>
+          <w:kern w:val="0"/>
+          <w14:ligatures w14:val="none"/>
+        </w:rPr>
+      </w:pPr>
+      <w:r>
+        <w:rPr>
+          <w:rFonts w:ascii="Times New Roman" w:eastAsia="Times New Roman" w:hAnsi="Times New Roman" w:cs="Times New Roman"/>
+          <w:kern w:val="0"/>
+          <w14:ligatures w14:val="none"/>
+        </w:rPr>
+        <w:t xml:space="preserve">Human-AI hybrid. </w:t>
+      </w:r>
+    </w:p>
+    <w:p>
+      <w:pPr>
+        <w:spacing w:before="100" w:beforeAutospacing="1" w:after="100" w:afterAutospacing="1" w:line="360" w:lineRule="auto"/>
+        <w:rPr>
+          <w:rFonts w:ascii="Times New Roman" w:eastAsia="Times New Roman" w:hAnsi="Times New Roman" w:cs="Times New Roman"/>
+          <w:kern w:val="0"/>
+          <w14:ligatures w14:val="none"/>
+        </w:rPr>
+      </w:pPr>
+      <w:r>
+        <w:rPr>
+          <w:rFonts w:ascii="Times New Roman" w:eastAsia="Times New Roman" w:hAnsi="Times New Roman" w:cs="Times New Roman"/>
+          <w:kern w:val="0"/>
+          <w14:ligatures w14:val="none"/>
+        </w:rPr>
+        <w:lastRenderedPageBreak/>
+        <w:t>Each participant completes several trials across the three conditions. However, the participant does not receive multiple versions of the same base topic. This restriction reduces direct comparison, repetition, and memory-contamination effects.</w:t>
+      </w:r>
+    </w:p>
+    <w:p>
+      <w:pPr>
+        <w:spacing w:before="100" w:beforeAutospacing="1" w:after="100" w:afterAutospacing="1" w:line="360" w:lineRule="auto"/>
+        <w:rPr>
+          <w:rFonts w:ascii="Times New Roman" w:eastAsia="Times New Roman" w:hAnsi="Times New Roman" w:cs="Times New Roman"/>
+          <w:kern w:val="0"/>
+          <w14:ligatures w14:val="none"/>
+        </w:rPr>
+      </w:pPr>
+      <w:r>
+        <w:rPr>
+          <w:rFonts w:ascii="Times New Roman" w:eastAsia="Times New Roman" w:hAnsi="Times New Roman" w:cs="Times New Roman"/>
+          <w:kern w:val="0"/>
+          <w14:ligatures w14:val="none"/>
+        </w:rPr>
+        <w:t>The independent variable is text condition. The main dependent variables are authorship classification, AI-likelihood rating, psycholinguistic-cue ratings, reading time, sentence-recognition accuracy, word-order reconstruction accuracy, and reaction time.</w:t>
+      </w:r>
+    </w:p>
+    <w:p>
+      <w:pPr>
+        <w:spacing w:before="100" w:beforeAutospacing="1" w:after="100" w:afterAutospacing="1" w:line="360" w:lineRule="auto"/>
+        <w:outlineLvl w:val="2"/>
+        <w:rPr>
+          <w:rFonts w:ascii="Times New Roman" w:eastAsia="Times New Roman" w:hAnsi="Times New Roman" w:cs="Times New Roman"/>
+          <w:b/>
+          <w:bCs/>
+          <w:kern w:val="0"/>
+          <w:sz w:val="27"/>
+          <w:szCs w:val="27"/>
+          <w14:ligatures w14:val="none"/>
+        </w:rPr>
+      </w:pPr>
+      <w:r>
+        <w:rPr>
+          <w:rFonts w:ascii="Times New Roman" w:eastAsia="Times New Roman" w:hAnsi="Times New Roman" w:cs="Times New Roman"/>
+          <w:b/>
+          <w:bCs/>
+          <w:kern w:val="0"/>
+          <w:sz w:val="27"/>
+          <w:szCs w:val="27"/>
+          <w14:ligatures w14:val="none"/>
+        </w:rPr>
+        <w:t>3.2 Participants</w:t>
+      </w:r>
+    </w:p>
+    <w:p>
+      <w:pPr>
+        <w:spacing w:before="100" w:beforeAutospacing="1" w:after="100" w:afterAutospacing="1" w:line="360" w:lineRule="auto"/>
+        <w:rPr>
+          <w:rFonts w:ascii="Times New Roman" w:eastAsia="Times New Roman" w:hAnsi="Times New Roman" w:cs="Times New Roman"/>
+          <w:kern w:val="0"/>
+          <w14:ligatures w14:val="none"/>
+        </w:rPr>
+      </w:pPr>
+      <w:r>
+        <w:rPr>
+          <w:rFonts w:ascii="Times New Roman" w:eastAsia="Times New Roman" w:hAnsi="Times New Roman" w:cs="Times New Roman"/>
+          <w:kern w:val="0"/>
+          <w14:ligatures w14:val="none"/>
+        </w:rPr>
+        <w:t>The intended sample consists of approximately 100 Chinese-English bilingual students. Participants are expected to use Chinese as their primary language and English as a second language. Participation is voluntary, and identifying information is not required.</w:t>
+      </w:r>
+    </w:p>
+    <w:p>
+      <w:pPr>
+        <w:spacing w:before="100" w:beforeAutospacing="1" w:after="100" w:afterAutospacing="1" w:line="360" w:lineRule="auto"/>
+        <w:rPr>
+          <w:rFonts w:ascii="Times New Roman" w:eastAsia="Times New Roman" w:hAnsi="Times New Roman" w:cs="Times New Roman"/>
+          <w:kern w:val="0"/>
+          <w14:ligatures w14:val="none"/>
+        </w:rPr>
+      </w:pPr>
+      <w:r>
+        <w:rPr>
+          <w:rFonts w:ascii="Times New Roman" w:eastAsia="Times New Roman" w:hAnsi="Times New Roman" w:cs="Times New Roman"/>
+          <w:kern w:val="0"/>
+          <w14:ligatures w14:val="none"/>
+        </w:rPr>
+        <w:t>Before entering the experimental trials, participants complete a background questionnaire containing:</w:t>
+      </w:r>
+    </w:p>
+    <w:p>
+      <w:pPr>
+        <w:numPr>
+          <w:ilvl w:val="0"/>
+          <w:numId w:val="3"/>
+        </w:numPr>
+        <w:spacing w:before="100" w:beforeAutospacing="1" w:after="100" w:afterAutospacing="1" w:line="360" w:lineRule="auto"/>
+        <w:rPr>
+          <w:rFonts w:ascii="Times New Roman" w:eastAsia="Times New Roman" w:hAnsi="Times New Roman" w:cs="Times New Roman"/>
+          <w:kern w:val="0"/>
+          <w14:ligatures w14:val="none"/>
+        </w:rPr>
+      </w:pPr>
+      <w:r>
+        <w:rPr>
+          <w:rFonts w:ascii="Times New Roman" w:eastAsia="Times New Roman" w:hAnsi="Times New Roman" w:cs="Times New Roman"/>
+          <w:kern w:val="0"/>
+          <w14:ligatures w14:val="none"/>
+        </w:rPr>
+        <w:t xml:space="preserve">Grade level; </w:t>
+      </w:r>
+    </w:p>
+    <w:p>
+      <w:pPr>
+        <w:numPr>
+          <w:ilvl w:val="0"/>
+          <w:numId w:val="3"/>
+        </w:numPr>
+        <w:spacing w:before="100" w:beforeAutospacing="1" w:after="100" w:afterAutospacing="1" w:line="360" w:lineRule="auto"/>
+        <w:rPr>
+          <w:rFonts w:ascii="Times New Roman" w:eastAsia="Times New Roman" w:hAnsi="Times New Roman" w:cs="Times New Roman"/>
+          <w:kern w:val="0"/>
+          <w14:ligatures w14:val="none"/>
+        </w:rPr>
+      </w:pPr>
+      <w:r>
+        <w:rPr>
+          <w:rFonts w:ascii="Times New Roman" w:eastAsia="Times New Roman" w:hAnsi="Times New Roman" w:cs="Times New Roman"/>
+          <w:kern w:val="0"/>
+          <w14:ligatures w14:val="none"/>
+        </w:rPr>
+        <w:t xml:space="preserve">Native language; </w:t>
+      </w:r>
+    </w:p>
+    <w:p>
+      <w:pPr>
+        <w:numPr>
+          <w:ilvl w:val="0"/>
+          <w:numId w:val="3"/>
+        </w:numPr>
+        <w:spacing w:before="100" w:beforeAutospacing="1" w:after="100" w:afterAutospacing="1" w:line="360" w:lineRule="auto"/>
+        <w:rPr>
+          <w:rFonts w:ascii="Times New Roman" w:eastAsia="Times New Roman" w:hAnsi="Times New Roman" w:cs="Times New Roman"/>
+          <w:kern w:val="0"/>
+          <w14:ligatures w14:val="none"/>
+        </w:rPr>
+      </w:pPr>
+      <w:r>
+        <w:rPr>
+          <w:rFonts w:ascii="Times New Roman" w:eastAsia="Times New Roman" w:hAnsi="Times New Roman" w:cs="Times New Roman"/>
+          <w:kern w:val="0"/>
+          <w14:ligatures w14:val="none"/>
+        </w:rPr>
+        <w:t xml:space="preserve">Years of English learning; </w:t>
+      </w:r>
+    </w:p>
+    <w:p>
+      <w:pPr>
+        <w:numPr>
+          <w:ilvl w:val="0"/>
+          <w:numId w:val="3"/>
+        </w:numPr>
+        <w:spacing w:before="100" w:beforeAutospacing="1" w:after="100" w:afterAutospacing="1" w:line="360" w:lineRule="auto"/>
+        <w:rPr>
+          <w:rFonts w:ascii="Times New Roman" w:eastAsia="Times New Roman" w:hAnsi="Times New Roman" w:cs="Times New Roman"/>
+          <w:kern w:val="0"/>
+          <w14:ligatures w14:val="none"/>
+        </w:rPr>
+      </w:pPr>
+      <w:r>
+        <w:rPr>
+          <w:rFonts w:ascii="Times New Roman" w:eastAsia="Times New Roman" w:hAnsi="Times New Roman" w:cs="Times New Roman"/>
+          <w:kern w:val="0"/>
+          <w14:ligatures w14:val="none"/>
+        </w:rPr>
+        <w:t xml:space="preserve">Self-rated English reading proficiency; </w:t>
+      </w:r>
+    </w:p>
+    <w:p>
+      <w:pPr>
+        <w:numPr>
+          <w:ilvl w:val="0"/>
+          <w:numId w:val="3"/>
+        </w:numPr>
+        <w:spacing w:before="100" w:beforeAutospacing="1" w:after="100" w:afterAutospacing="1" w:line="360" w:lineRule="auto"/>
+        <w:rPr>
+          <w:rFonts w:ascii="Times New Roman" w:eastAsia="Times New Roman" w:hAnsi="Times New Roman" w:cs="Times New Roman"/>
+          <w:kern w:val="0"/>
+          <w14:ligatures w14:val="none"/>
+        </w:rPr>
+      </w:pPr>
+      <w:r>
+        <w:rPr>
+          <w:rFonts w:ascii="Times New Roman" w:eastAsia="Times New Roman" w:hAnsi="Times New Roman" w:cs="Times New Roman"/>
+          <w:kern w:val="0"/>
+          <w14:ligatures w14:val="none"/>
+        </w:rPr>
+        <w:t xml:space="preserve">Self-rated Chinese proficiency; </w:t>
+      </w:r>
+    </w:p>
+    <w:p>
+      <w:pPr>
+        <w:numPr>
+          <w:ilvl w:val="0"/>
+          <w:numId w:val="3"/>
+        </w:numPr>
+        <w:spacing w:before="100" w:beforeAutospacing="1" w:after="100" w:afterAutospacing="1" w:line="360" w:lineRule="auto"/>
+        <w:rPr>
+          <w:rFonts w:ascii="Times New Roman" w:eastAsia="Times New Roman" w:hAnsi="Times New Roman" w:cs="Times New Roman"/>
+          <w:kern w:val="0"/>
+          <w14:ligatures w14:val="none"/>
+        </w:rPr>
+      </w:pPr>
+      <w:r>
+        <w:rPr>
+          <w:rFonts w:ascii="Times New Roman" w:eastAsia="Times New Roman" w:hAnsi="Times New Roman" w:cs="Times New Roman"/>
+          <w:kern w:val="0"/>
+          <w14:ligatures w14:val="none"/>
+        </w:rPr>
+        <w:t xml:space="preserve">Frequency of English reading; </w:t>
+      </w:r>
+    </w:p>
+    <w:p>
+      <w:pPr>
+        <w:numPr>
+          <w:ilvl w:val="0"/>
+          <w:numId w:val="3"/>
+        </w:numPr>
+        <w:spacing w:before="100" w:beforeAutospacing="1" w:after="100" w:afterAutospacing="1" w:line="360" w:lineRule="auto"/>
+        <w:rPr>
+          <w:rFonts w:ascii="Times New Roman" w:eastAsia="Times New Roman" w:hAnsi="Times New Roman" w:cs="Times New Roman"/>
+          <w:kern w:val="0"/>
+          <w14:ligatures w14:val="none"/>
+        </w:rPr>
+      </w:pPr>
+      <w:r>
+        <w:rPr>
+          <w:rFonts w:ascii="Times New Roman" w:eastAsia="Times New Roman" w:hAnsi="Times New Roman" w:cs="Times New Roman"/>
+          <w:kern w:val="0"/>
+          <w14:ligatures w14:val="none"/>
+        </w:rPr>
+        <w:t xml:space="preserve">Frequency of AI-tool use; </w:t>
+      </w:r>
+    </w:p>
+    <w:p>
+      <w:pPr>
+        <w:numPr>
+          <w:ilvl w:val="0"/>
+          <w:numId w:val="3"/>
+        </w:numPr>
+        <w:spacing w:before="100" w:beforeAutospacing="1" w:after="100" w:afterAutospacing="1" w:line="360" w:lineRule="auto"/>
+        <w:rPr>
+          <w:rFonts w:ascii="Times New Roman" w:eastAsia="Times New Roman" w:hAnsi="Times New Roman" w:cs="Times New Roman"/>
+          <w:kern w:val="0"/>
+          <w14:ligatures w14:val="none"/>
+        </w:rPr>
+      </w:pPr>
+      <w:r>
+        <w:rPr>
+          <w:rFonts w:ascii="Times New Roman" w:eastAsia="Times New Roman" w:hAnsi="Times New Roman" w:cs="Times New Roman"/>
+          <w:kern w:val="0"/>
+          <w14:ligatures w14:val="none"/>
+        </w:rPr>
+        <w:t xml:space="preserve">Familiarity with AI-generated writing. </w:t>
+      </w:r>
+    </w:p>
+    <w:p>
+      <w:pPr>
+        <w:spacing w:before="100" w:beforeAutospacing="1" w:after="100" w:afterAutospacing="1" w:line="360" w:lineRule="auto"/>
+        <w:rPr>
+          <w:rFonts w:ascii="Times New Roman" w:eastAsia="Times New Roman" w:hAnsi="Times New Roman" w:cs="Times New Roman"/>
+          <w:kern w:val="0"/>
+          <w14:ligatures w14:val="none"/>
+        </w:rPr>
+      </w:pPr>
+      <w:r>
+        <w:rPr>
+          <w:rFonts w:ascii="Times New Roman" w:eastAsia="Times New Roman" w:hAnsi="Times New Roman" w:cs="Times New Roman"/>
+          <w:kern w:val="0"/>
+          <w14:ligatures w14:val="none"/>
+        </w:rPr>
+        <w:t>These variables are recorded because language proficiency, reading experience, and exposure to AI tools may influence authorship judgment and memory performance.</w:t>
+      </w:r>
+    </w:p>
+    <w:p>
+      <w:pPr>
+        <w:spacing w:before="100" w:beforeAutospacing="1" w:after="100" w:afterAutospacing="1" w:line="360" w:lineRule="auto"/>
+        <w:outlineLvl w:val="2"/>
+        <w:rPr>
+          <w:rFonts w:ascii="Times New Roman" w:eastAsia="Times New Roman" w:hAnsi="Times New Roman" w:cs="Times New Roman"/>
+          <w:b/>
+          <w:bCs/>
+          <w:kern w:val="0"/>
+          <w:sz w:val="27"/>
+          <w:szCs w:val="27"/>
+          <w14:ligatures w14:val="none"/>
+        </w:rPr>
+      </w:pPr>
+      <w:r>
+        <w:rPr>
+          <w:rFonts w:ascii="Times New Roman" w:eastAsia="Times New Roman" w:hAnsi="Times New Roman" w:cs="Times New Roman"/>
+          <w:b/>
+          <w:bCs/>
+          <w:kern w:val="0"/>
+          <w:sz w:val="27"/>
+          <w:szCs w:val="27"/>
+          <w14:ligatures w14:val="none"/>
+        </w:rPr>
+        <w:t>3.3 Construction of the Experimental Corpus</w:t>
+      </w:r>
+    </w:p>
+    <w:p>
+      <w:pPr>
+        <w:spacing w:before="100" w:beforeAutospacing="1" w:after="100" w:afterAutospacing="1" w:line="360" w:lineRule="auto"/>
+        <w:rPr>
+          <w:rFonts w:ascii="Times New Roman" w:eastAsia="Times New Roman" w:hAnsi="Times New Roman" w:cs="Times New Roman"/>
+          <w:kern w:val="0"/>
+          <w14:ligatures w14:val="none"/>
+        </w:rPr>
+      </w:pPr>
+      <w:r>
+        <w:rPr>
+          <w:rFonts w:ascii="Times New Roman" w:eastAsia="Times New Roman" w:hAnsi="Times New Roman" w:cs="Times New Roman"/>
+          <w:kern w:val="0"/>
+          <w14:ligatures w14:val="none"/>
+        </w:rPr>
+        <w:t xml:space="preserve">The stimulus corpus is organized around </w:t>
+      </w:r>
+      <w:r>
+        <w:rPr>
+          <w:rFonts w:ascii="Times New Roman" w:eastAsia="Times New Roman" w:hAnsi="Times New Roman" w:cs="Times New Roman"/>
+          <w:b/>
+          <w:bCs/>
+          <w:kern w:val="0"/>
+          <w14:ligatures w14:val="none"/>
+        </w:rPr>
+        <w:t>20 human-written English base passages</w:t>
+      </w:r>
+      <w:r>
+        <w:rPr>
+          <w:rFonts w:ascii="Times New Roman" w:eastAsia="Times New Roman" w:hAnsi="Times New Roman" w:cs="Times New Roman"/>
+          <w:kern w:val="0"/>
+          <w14:ligatures w14:val="none"/>
+        </w:rPr>
+        <w:t>. Each base passage represents a separate topic and serves as the foundation of one matched triplet.</w:t>
+      </w:r>
+    </w:p>
+    <w:p>
+      <w:pPr>
+        <w:spacing w:before="100" w:beforeAutospacing="1" w:after="100" w:afterAutospacing="1" w:line="360" w:lineRule="auto"/>
+        <w:rPr>
+          <w:rFonts w:ascii="Times New Roman" w:eastAsia="Times New Roman" w:hAnsi="Times New Roman" w:cs="Times New Roman"/>
+          <w:kern w:val="0"/>
+          <w14:ligatures w14:val="none"/>
+        </w:rPr>
+      </w:pPr>
+      <w:r>
+        <w:rPr>
+          <w:rFonts w:ascii="Times New Roman" w:eastAsia="Times New Roman" w:hAnsi="Times New Roman" w:cs="Times New Roman"/>
+          <w:kern w:val="0"/>
+          <w14:ligatures w14:val="none"/>
+        </w:rPr>
+        <w:lastRenderedPageBreak/>
+        <w:t>Before formal data collection, two corresponding versions are prepared through the researcher administration platform:</w:t>
+      </w:r>
+    </w:p>
+    <w:p>
+      <w:pPr>
+        <w:numPr>
+          <w:ilvl w:val="0"/>
+          <w:numId w:val="4"/>
+        </w:numPr>
+        <w:spacing w:before="100" w:beforeAutospacing="1" w:after="100" w:afterAutospacing="1" w:line="360" w:lineRule="auto"/>
+        <w:rPr>
+          <w:rFonts w:ascii="Times New Roman" w:eastAsia="Times New Roman" w:hAnsi="Times New Roman" w:cs="Times New Roman"/>
+          <w:kern w:val="0"/>
+          <w14:ligatures w14:val="none"/>
+        </w:rPr>
+      </w:pPr>
+      <w:r>
+        <w:rPr>
+          <w:rFonts w:ascii="Times New Roman" w:eastAsia="Times New Roman" w:hAnsi="Times New Roman" w:cs="Times New Roman"/>
+          <w:kern w:val="0"/>
+          <w14:ligatures w14:val="none"/>
+        </w:rPr>
+        <w:t xml:space="preserve">An </w:t>
+      </w:r>
+      <w:r>
+        <w:rPr>
+          <w:rFonts w:ascii="Times New Roman" w:eastAsia="Times New Roman" w:hAnsi="Times New Roman" w:cs="Times New Roman"/>
+          <w:b/>
+          <w:bCs/>
+          <w:kern w:val="0"/>
+          <w14:ligatures w14:val="none"/>
+        </w:rPr>
+        <w:t>AI-generated version</w:t>
+      </w:r>
+      <w:r>
+        <w:rPr>
+          <w:rFonts w:ascii="Times New Roman" w:eastAsia="Times New Roman" w:hAnsi="Times New Roman" w:cs="Times New Roman"/>
+          <w:kern w:val="0"/>
+          <w14:ligatures w14:val="none"/>
+        </w:rPr>
+        <w:t xml:space="preserve">, written independently by the model under the same topic, genre, length, and difficulty constraints; </w:t>
+      </w:r>
+    </w:p>
+    <w:p>
+      <w:pPr>
+        <w:numPr>
+          <w:ilvl w:val="0"/>
+          <w:numId w:val="4"/>
+        </w:numPr>
+        <w:spacing w:before="100" w:beforeAutospacing="1" w:after="100" w:afterAutospacing="1" w:line="360" w:lineRule="auto"/>
+        <w:rPr>
+          <w:rFonts w:ascii="Times New Roman" w:eastAsia="Times New Roman" w:hAnsi="Times New Roman" w:cs="Times New Roman"/>
+          <w:kern w:val="0"/>
+          <w14:ligatures w14:val="none"/>
+        </w:rPr>
+      </w:pPr>
+      <w:r>
+        <w:rPr>
+          <w:rFonts w:ascii="Times New Roman" w:eastAsia="Times New Roman" w:hAnsi="Times New Roman" w:cs="Times New Roman"/>
+          <w:kern w:val="0"/>
+          <w14:ligatures w14:val="none"/>
+        </w:rPr>
+        <w:t xml:space="preserve">A </w:t>
+      </w:r>
+      <w:r>
+        <w:rPr>
+          <w:rFonts w:ascii="Times New Roman" w:eastAsia="Times New Roman" w:hAnsi="Times New Roman" w:cs="Times New Roman"/>
+          <w:b/>
+          <w:bCs/>
+          <w:kern w:val="0"/>
+          <w14:ligatures w14:val="none"/>
+        </w:rPr>
+        <w:t>human-AI hybrid version</w:t>
+      </w:r>
+      <w:r>
+        <w:rPr>
+          <w:rFonts w:ascii="Times New Roman" w:eastAsia="Times New Roman" w:hAnsi="Times New Roman" w:cs="Times New Roman"/>
+          <w:kern w:val="0"/>
+          <w14:ligatures w14:val="none"/>
+        </w:rPr>
+        <w:t xml:space="preserve">, produced by applying a standardized AI-assisted editing procedure to the original human-written passage. </w:t>
+      </w:r>
+    </w:p>
+    <w:p>
+      <w:pPr>
+        <w:spacing w:before="100" w:beforeAutospacing="1" w:after="100" w:afterAutospacing="1" w:line="360" w:lineRule="auto"/>
+        <w:rPr>
+          <w:rFonts w:ascii="Times New Roman" w:eastAsia="Times New Roman" w:hAnsi="Times New Roman" w:cs="Times New Roman"/>
+          <w:kern w:val="0"/>
+          <w14:ligatures w14:val="none"/>
+        </w:rPr>
+      </w:pPr>
+      <w:r>
+        <w:rPr>
+          <w:rFonts w:ascii="Times New Roman" w:eastAsia="Times New Roman" w:hAnsi="Times New Roman" w:cs="Times New Roman"/>
+          <w:kern w:val="0"/>
+          <w14:ligatures w14:val="none"/>
+        </w:rPr>
+        <w:t>The completed corpus therefore contains:</w:t>
+      </w:r>
+    </w:p>
+    <w:tbl>
+      <w:tblPr>
+        <w:tblW w:w="0" w:type="auto"/>
+        <w:tblCellSpacing w:w="15" w:type="dxa"/>
+        <w:tblCellMar>
+          <w:top w:w="15" w:type="dxa"/>
+          <w:left w:w="15" w:type="dxa"/>
+          <w:bottom w:w="15" w:type="dxa"/>
+          <w:right w:w="15" w:type="dxa"/>
+        </w:tblCellMar>
+        <w:tblLook w:val="04A0" w:firstRow="1" w:lastRow="0" w:firstColumn="1" w:lastColumn="0" w:noHBand="0" w:noVBand="1"/>
+      </w:tblPr>
+      <w:tblGrid>
+        <w:gridCol w:w="1802"/>
+        <w:gridCol w:w="2129"/>
+      </w:tblGrid>
+      <w:tr>
+        <w:trPr>
+          <w:tblHeader/>
+          <w:tblCellSpacing w:w="15" w:type="dxa"/>
+        </w:trPr>
+        <w:tc>
+          <w:tcPr>
+            <w:tcW w:w="0" w:type="auto"/>
+            <w:vAlign w:val="center"/>
+            <w:hideMark/>
+          </w:tcPr>
+          <w:p>
+            <w:pPr>
+              <w:spacing w:after="0" w:line="360" w:lineRule="auto"/>
+              <w:jc w:val="center"/>
+              <w:rPr>
+                <w:rFonts w:ascii="Times New Roman" w:eastAsia="Times New Roman" w:hAnsi="Times New Roman" w:cs="Times New Roman"/>
+                <w:b/>
+                <w:bCs/>
+                <w:kern w:val="0"/>
+                <w14:ligatures w14:val="none"/>
+              </w:rPr>
+            </w:pPr>
+            <w:r>
+              <w:rPr>
+                <w:rFonts w:ascii="Times New Roman" w:eastAsia="Times New Roman" w:hAnsi="Times New Roman" w:cs="Times New Roman"/>
+                <w:b/>
+                <w:bCs/>
+                <w:kern w:val="0"/>
+                <w14:ligatures w14:val="none"/>
+              </w:rPr>
+              <w:t>Condition</w:t>
+            </w:r>
+          </w:p>
+        </w:tc>
+        <w:tc>
+          <w:tcPr>
+            <w:tcW w:w="0" w:type="auto"/>
+            <w:vAlign w:val="center"/>
+            <w:hideMark/>
+          </w:tcPr>
+          <w:p>
+            <w:pPr>
+              <w:spacing w:after="0" w:line="360" w:lineRule="auto"/>
+              <w:jc w:val="center"/>
+              <w:rPr>
+                <w:rFonts w:ascii="Times New Roman" w:eastAsia="Times New Roman" w:hAnsi="Times New Roman" w:cs="Times New Roman"/>
+                <w:b/>
+                <w:bCs/>
+                <w:kern w:val="0"/>
+                <w14:ligatures w14:val="none"/>
+              </w:rPr>
+            </w:pPr>
+            <w:r>
+              <w:rPr>
+                <w:rFonts w:ascii="Times New Roman" w:eastAsia="Times New Roman" w:hAnsi="Times New Roman" w:cs="Times New Roman"/>
+                <w:b/>
+                <w:bCs/>
+                <w:kern w:val="0"/>
+                <w14:ligatures w14:val="none"/>
+              </w:rPr>
+              <w:t>Number of passages</w:t>
+            </w:r>
+          </w:p>
+        </w:tc>
+      </w:tr>
+      <w:tr>
+        <w:trPr>
+          <w:tblCellSpacing w:w="15" w:type="dxa"/>
+        </w:trPr>
+        <w:tc>
+          <w:tcPr>
+            <w:tcW w:w="0" w:type="auto"/>
+            <w:vAlign w:val="center"/>
+            <w:hideMark/>
+          </w:tcPr>
+          <w:p>
+            <w:pPr>
+              <w:spacing w:after="0" w:line="360" w:lineRule="auto"/>
+              <w:rPr>
+                <w:rFonts w:ascii="Times New Roman" w:eastAsia="Times New Roman" w:hAnsi="Times New Roman" w:cs="Times New Roman"/>
+                <w:kern w:val="0"/>
+                <w14:ligatures w14:val="none"/>
+              </w:rPr>
+            </w:pPr>
+            <w:r>
+              <w:rPr>
+                <w:rFonts w:ascii="Times New Roman" w:eastAsia="Times New Roman" w:hAnsi="Times New Roman" w:cs="Times New Roman"/>
+                <w:kern w:val="0"/>
+                <w14:ligatures w14:val="none"/>
+              </w:rPr>
+              <w:t>Human-written</w:t>
+            </w:r>
+          </w:p>
+        </w:tc>
+        <w:tc>
+          <w:tcPr>
+            <w:tcW w:w="0" w:type="auto"/>
+            <w:vAlign w:val="center"/>
+            <w:hideMark/>
+          </w:tcPr>
+          <w:p>
+            <w:pPr>
+              <w:spacing w:after="0" w:line="360" w:lineRule="auto"/>
+              <w:rPr>
+                <w:rFonts w:ascii="Times New Roman" w:eastAsia="Times New Roman" w:hAnsi="Times New Roman" w:cs="Times New Roman"/>
+                <w:kern w:val="0"/>
+                <w14:ligatures w14:val="none"/>
+              </w:rPr>
+            </w:pPr>
+            <w:r>
+              <w:rPr>
+                <w:rFonts w:ascii="Times New Roman" w:eastAsia="Times New Roman" w:hAnsi="Times New Roman" w:cs="Times New Roman"/>
+                <w:kern w:val="0"/>
+                <w14:ligatures w14:val="none"/>
+              </w:rPr>
+              <w:t>20</w:t>
+            </w:r>
+          </w:p>
+        </w:tc>
+      </w:tr>
+      <w:tr>
+        <w:trPr>
+          <w:tblCellSpacing w:w="15" w:type="dxa"/>
+        </w:trPr>
+        <w:tc>
+          <w:tcPr>
+            <w:tcW w:w="0" w:type="auto"/>
+            <w:vAlign w:val="center"/>
+            <w:hideMark/>
+          </w:tcPr>
+          <w:p>
+            <w:pPr>
+              <w:spacing w:after="0" w:line="360" w:lineRule="auto"/>
+              <w:rPr>
+                <w:rFonts w:ascii="Times New Roman" w:eastAsia="Times New Roman" w:hAnsi="Times New Roman" w:cs="Times New Roman"/>
+                <w:kern w:val="0"/>
+                <w14:ligatures w14:val="none"/>
+              </w:rPr>
+            </w:pPr>
+            <w:r>
+              <w:rPr>
+                <w:rFonts w:ascii="Times New Roman" w:eastAsia="Times New Roman" w:hAnsi="Times New Roman" w:cs="Times New Roman"/>
+                <w:kern w:val="0"/>
+                <w14:ligatures w14:val="none"/>
+              </w:rPr>
+              <w:t>AI-generated</w:t>
+            </w:r>
+          </w:p>
+        </w:tc>
+        <w:tc>
+          <w:tcPr>
+            <w:tcW w:w="0" w:type="auto"/>
+            <w:vAlign w:val="center"/>
+            <w:hideMark/>
+          </w:tcPr>
+          <w:p>
+            <w:pPr>
+              <w:spacing w:after="0" w:line="360" w:lineRule="auto"/>
+              <w:rPr>
+                <w:rFonts w:ascii="Times New Roman" w:eastAsia="Times New Roman" w:hAnsi="Times New Roman" w:cs="Times New Roman"/>
+                <w:kern w:val="0"/>
+                <w14:ligatures w14:val="none"/>
+              </w:rPr>
+            </w:pPr>
+            <w:r>
+              <w:rPr>
+                <w:rFonts w:ascii="Times New Roman" w:eastAsia="Times New Roman" w:hAnsi="Times New Roman" w:cs="Times New Roman"/>
+                <w:kern w:val="0"/>
+                <w14:ligatures w14:val="none"/>
+              </w:rPr>
+              <w:t>20</w:t>
+            </w:r>
+          </w:p>
+        </w:tc>
+      </w:tr>
+      <w:tr>
+        <w:trPr>
+          <w:tblCellSpacing w:w="15" w:type="dxa"/>
+        </w:trPr>
+        <w:tc>
+          <w:tcPr>
+            <w:tcW w:w="0" w:type="auto"/>
+            <w:vAlign w:val="center"/>
+            <w:hideMark/>
+          </w:tcPr>
+          <w:p>
+            <w:pPr>
+              <w:spacing w:after="0" w:line="360" w:lineRule="auto"/>
+              <w:rPr>
+                <w:rFonts w:ascii="Times New Roman" w:eastAsia="Times New Roman" w:hAnsi="Times New Roman" w:cs="Times New Roman"/>
+                <w:kern w:val="0"/>
+                <w14:ligatures w14:val="none"/>
+              </w:rPr>
+            </w:pPr>
+            <w:r>
+              <w:rPr>
+                <w:rFonts w:ascii="Times New Roman" w:eastAsia="Times New Roman" w:hAnsi="Times New Roman" w:cs="Times New Roman"/>
+                <w:kern w:val="0"/>
+                <w14:ligatures w14:val="none"/>
+              </w:rPr>
+              <w:t>Human-AI hybrid</w:t>
+            </w:r>
+          </w:p>
+        </w:tc>
+        <w:tc>
+          <w:tcPr>
+            <w:tcW w:w="0" w:type="auto"/>
+            <w:vAlign w:val="center"/>
+            <w:hideMark/>
+          </w:tcPr>
+          <w:p>
+            <w:pPr>
+              <w:spacing w:after="0" w:line="360" w:lineRule="auto"/>
+              <w:rPr>
+                <w:rFonts w:ascii="Times New Roman" w:eastAsia="Times New Roman" w:hAnsi="Times New Roman" w:cs="Times New Roman"/>
+                <w:kern w:val="0"/>
+                <w14:ligatures w14:val="none"/>
+              </w:rPr>
+            </w:pPr>
+            <w:r>
+              <w:rPr>
+                <w:rFonts w:ascii="Times New Roman" w:eastAsia="Times New Roman" w:hAnsi="Times New Roman" w:cs="Times New Roman"/>
+                <w:kern w:val="0"/>
+                <w14:ligatures w14:val="none"/>
+              </w:rPr>
+              <w:t>20</w:t>
+            </w:r>
+          </w:p>
+        </w:tc>
+      </w:tr>
+      <w:tr>
+        <w:trPr>
+          <w:tblCellSpacing w:w="15" w:type="dxa"/>
+        </w:trPr>
+        <w:tc>
+          <w:tcPr>
+            <w:tcW w:w="0" w:type="auto"/>
+            <w:vAlign w:val="center"/>
+            <w:hideMark/>
+          </w:tcPr>
+          <w:p>
+            <w:pPr>
+              <w:spacing w:after="0" w:line="360" w:lineRule="auto"/>
+              <w:rPr>
+                <w:rFonts w:ascii="Times New Roman" w:eastAsia="Times New Roman" w:hAnsi="Times New Roman" w:cs="Times New Roman"/>
+                <w:kern w:val="0"/>
+                <w14:ligatures w14:val="none"/>
+              </w:rPr>
+            </w:pPr>
+            <w:r>
+              <w:rPr>
+                <w:rFonts w:ascii="Times New Roman" w:eastAsia="Times New Roman" w:hAnsi="Times New Roman" w:cs="Times New Roman"/>
+                <w:b/>
+                <w:bCs/>
+                <w:kern w:val="0"/>
+                <w14:ligatures w14:val="none"/>
+              </w:rPr>
+              <w:t>Total</w:t>
+            </w:r>
+          </w:p>
+        </w:tc>
+        <w:tc>
+          <w:tcPr>
+            <w:tcW w:w="0" w:type="auto"/>
+            <w:vAlign w:val="center"/>
+            <w:hideMark/>
+          </w:tcPr>
+          <w:p>
+            <w:pPr>
+              <w:spacing w:after="0" w:line="360" w:lineRule="auto"/>
+              <w:rPr>
+                <w:rFonts w:ascii="Times New Roman" w:eastAsia="Times New Roman" w:hAnsi="Times New Roman" w:cs="Times New Roman"/>
+                <w:kern w:val="0"/>
+                <w14:ligatures w14:val="none"/>
+              </w:rPr>
+            </w:pPr>
+            <w:r>
+              <w:rPr>
+                <w:rFonts w:ascii="Times New Roman" w:eastAsia="Times New Roman" w:hAnsi="Times New Roman" w:cs="Times New Roman"/>
+                <w:b/>
+                <w:bCs/>
+                <w:kern w:val="0"/>
+                <w14:ligatures w14:val="none"/>
+              </w:rPr>
+              <w:t>60</w:t>
+            </w:r>
+          </w:p>
+        </w:tc>
+      </w:tr>
+    </w:tbl>
+    <w:p>
+      <w:pPr>
+        <w:spacing w:before="100" w:beforeAutospacing="1" w:after="100" w:afterAutospacing="1" w:line="360" w:lineRule="auto"/>
+        <w:rPr>
+          <w:rFonts w:ascii="Times New Roman" w:eastAsia="Times New Roman" w:hAnsi="Times New Roman" w:cs="Times New Roman"/>
+          <w:kern w:val="0"/>
+          <w14:ligatures w14:val="none"/>
+        </w:rPr>
+      </w:pPr>
+      <w:r>
+        <w:rPr>
+          <w:rFonts w:ascii="Times New Roman" w:eastAsia="Times New Roman" w:hAnsi="Times New Roman" w:cs="Times New Roman"/>
+          <w:kern w:val="0"/>
+          <w14:ligatures w14:val="none"/>
+        </w:rPr>
+        <w:t>Each matched triplet shares the same base topic. Texts are controlled as closely as possible for genre, approximate length, vocabulary level, emotional valence, narrative perspective, and informational content.</w:t>
+      </w:r>
+    </w:p>
+    <w:p>
+      <w:pPr>
+        <w:spacing w:before="100" w:beforeAutospacing="1" w:after="100" w:afterAutospacing="1" w:line="360" w:lineRule="auto"/>
+        <w:rPr>
+          <w:rFonts w:ascii="Times New Roman" w:eastAsia="Times New Roman" w:hAnsi="Times New Roman" w:cs="Times New Roman"/>
+          <w:kern w:val="0"/>
+          <w14:ligatures w14:val="none"/>
+        </w:rPr>
+      </w:pPr>
+      <w:r>
+        <w:rPr>
+          <w:rFonts w:ascii="Times New Roman" w:eastAsia="Times New Roman" w:hAnsi="Times New Roman" w:cs="Times New Roman"/>
+          <w:kern w:val="0"/>
+          <w14:ligatures w14:val="none"/>
+        </w:rPr>
+        <w:t>The human-written passage represents the original source version. The AI-generated passage is created independently rather than through direct paraphrasing, but it follows the same topic and material constraints. The hybrid passage retains the main content of the human passage while receiving AI-assisted revision in wording, fluency, organization, or tone.</w:t>
+      </w:r>
+    </w:p>
+    <w:p>
+      <w:pPr>
+        <w:spacing w:before="100" w:beforeAutospacing="1" w:after="100" w:afterAutospacing="1" w:line="360" w:lineRule="auto"/>
+        <w:rPr>
+          <w:rFonts w:ascii="Times New Roman" w:eastAsia="Times New Roman" w:hAnsi="Times New Roman" w:cs="Times New Roman"/>
+          <w:kern w:val="0"/>
+          <w14:ligatures w14:val="none"/>
+        </w:rPr>
+      </w:pPr>
+      <w:r>
+        <w:rPr>
+          <w:rFonts w:ascii="Times New Roman" w:eastAsia="Times New Roman" w:hAnsi="Times New Roman" w:cs="Times New Roman"/>
+          <w:kern w:val="0"/>
+          <w14:ligatures w14:val="none"/>
+        </w:rPr>
+        <w:t>All AI and hybrid passages are generated before participant recruitment. They are reviewed and saved in the administrator corpus rather than generated dynamically during individual experimental sessions. This procedure ensures that participants respond to a fixed and researcher-approved collection of stimuli.</w:t>
+      </w:r>
+    </w:p>
+    <w:p>
+      <w:pPr>
+        <w:spacing w:before="100" w:beforeAutospacing="1" w:after="100" w:afterAutospacing="1" w:line="360" w:lineRule="auto"/>
+        <w:rPr>
+          <w:rFonts w:ascii="Times New Roman" w:eastAsia="Times New Roman" w:hAnsi="Times New Roman" w:cs="Times New Roman"/>
+          <w:kern w:val="0"/>
+          <w14:ligatures w14:val="none"/>
+        </w:rPr>
+      </w:pPr>
+      <w:r>
+        <w:rPr>
+          <w:rFonts w:ascii="Times New Roman" w:eastAsia="Times New Roman" w:hAnsi="Times New Roman" w:cs="Times New Roman"/>
+          <w:kern w:val="0"/>
+          <w14:ligatures w14:val="none"/>
+        </w:rPr>
+        <w:t>Each passage is assigned metadata, including:</w:t>
+      </w:r>
+    </w:p>
+    <w:p>
+      <w:pPr>
+        <w:numPr>
+          <w:ilvl w:val="0"/>
+          <w:numId w:val="5"/>
+        </w:numPr>
+        <w:spacing w:before="100" w:beforeAutospacing="1" w:after="100" w:afterAutospacing="1" w:line="360" w:lineRule="auto"/>
+        <w:rPr>
+          <w:rFonts w:ascii="Times New Roman" w:eastAsia="Times New Roman" w:hAnsi="Times New Roman" w:cs="Times New Roman"/>
+          <w:kern w:val="0"/>
+          <w14:ligatures w14:val="none"/>
+        </w:rPr>
+      </w:pPr>
+      <w:r>
+        <w:rPr>
+          <w:rFonts w:ascii="Times New Roman" w:eastAsia="Times New Roman" w:hAnsi="Times New Roman" w:cs="Times New Roman"/>
+          <w:kern w:val="0"/>
+          <w14:ligatures w14:val="none"/>
+        </w:rPr>
+        <w:t xml:space="preserve">Text ID; </w:t>
+      </w:r>
+    </w:p>
+    <w:p>
+      <w:pPr>
+        <w:numPr>
+          <w:ilvl w:val="0"/>
+          <w:numId w:val="5"/>
+        </w:numPr>
+        <w:spacing w:before="100" w:beforeAutospacing="1" w:after="100" w:afterAutospacing="1" w:line="360" w:lineRule="auto"/>
+        <w:rPr>
+          <w:rFonts w:ascii="Times New Roman" w:eastAsia="Times New Roman" w:hAnsi="Times New Roman" w:cs="Times New Roman"/>
+          <w:kern w:val="0"/>
+          <w14:ligatures w14:val="none"/>
+        </w:rPr>
+      </w:pPr>
+      <w:r>
+        <w:rPr>
+          <w:rFonts w:ascii="Times New Roman" w:eastAsia="Times New Roman" w:hAnsi="Times New Roman" w:cs="Times New Roman"/>
+          <w:kern w:val="0"/>
+          <w14:ligatures w14:val="none"/>
+        </w:rPr>
+        <w:lastRenderedPageBreak/>
+        <w:t xml:space="preserve">Topic; </w:t>
+      </w:r>
+    </w:p>
+    <w:p>
+      <w:pPr>
+        <w:numPr>
+          <w:ilvl w:val="0"/>
+          <w:numId w:val="5"/>
+        </w:numPr>
+        <w:spacing w:before="100" w:beforeAutospacing="1" w:after="100" w:afterAutospacing="1" w:line="360" w:lineRule="auto"/>
+        <w:rPr>
+          <w:rFonts w:ascii="Times New Roman" w:eastAsia="Times New Roman" w:hAnsi="Times New Roman" w:cs="Times New Roman"/>
+          <w:kern w:val="0"/>
+          <w14:ligatures w14:val="none"/>
+        </w:rPr>
+      </w:pPr>
+      <w:r>
+        <w:rPr>
+          <w:rFonts w:ascii="Times New Roman" w:eastAsia="Times New Roman" w:hAnsi="Times New Roman" w:cs="Times New Roman"/>
+          <w:kern w:val="0"/>
+          <w14:ligatures w14:val="none"/>
+        </w:rPr>
+        <w:t xml:space="preserve">Authorship condition; </w:t>
+      </w:r>
+    </w:p>
+    <w:p>
+      <w:pPr>
+        <w:numPr>
+          <w:ilvl w:val="0"/>
+          <w:numId w:val="5"/>
+        </w:numPr>
+        <w:spacing w:before="100" w:beforeAutospacing="1" w:after="100" w:afterAutospacing="1" w:line="360" w:lineRule="auto"/>
+        <w:rPr>
+          <w:rFonts w:ascii="Times New Roman" w:eastAsia="Times New Roman" w:hAnsi="Times New Roman" w:cs="Times New Roman"/>
+          <w:kern w:val="0"/>
+          <w14:ligatures w14:val="none"/>
+        </w:rPr>
+      </w:pPr>
+      <w:r>
+        <w:rPr>
+          <w:rFonts w:ascii="Times New Roman" w:eastAsia="Times New Roman" w:hAnsi="Times New Roman" w:cs="Times New Roman"/>
+          <w:kern w:val="0"/>
+          <w14:ligatures w14:val="none"/>
+        </w:rPr>
+        <w:t xml:space="preserve">Pair or triplet ID; </w:t>
+      </w:r>
+    </w:p>
+    <w:p>
+      <w:pPr>
+        <w:numPr>
+          <w:ilvl w:val="0"/>
+          <w:numId w:val="5"/>
+        </w:numPr>
+        <w:spacing w:before="100" w:beforeAutospacing="1" w:after="100" w:afterAutospacing="1" w:line="360" w:lineRule="auto"/>
+        <w:rPr>
+          <w:rFonts w:ascii="Times New Roman" w:eastAsia="Times New Roman" w:hAnsi="Times New Roman" w:cs="Times New Roman"/>
+          <w:kern w:val="0"/>
+          <w14:ligatures w14:val="none"/>
+        </w:rPr>
+      </w:pPr>
+      <w:r>
+        <w:rPr>
+          <w:rFonts w:ascii="Times New Roman" w:eastAsia="Times New Roman" w:hAnsi="Times New Roman" w:cs="Times New Roman"/>
+          <w:kern w:val="0"/>
+          <w14:ligatures w14:val="none"/>
+        </w:rPr>
+        <w:t xml:space="preserve">Genre; </w:t>
+      </w:r>
+    </w:p>
+    <w:p>
+      <w:pPr>
+        <w:numPr>
+          <w:ilvl w:val="0"/>
+          <w:numId w:val="5"/>
+        </w:numPr>
+        <w:spacing w:before="100" w:beforeAutospacing="1" w:after="100" w:afterAutospacing="1" w:line="360" w:lineRule="auto"/>
+        <w:rPr>
+          <w:rFonts w:ascii="Times New Roman" w:eastAsia="Times New Roman" w:hAnsi="Times New Roman" w:cs="Times New Roman"/>
+          <w:kern w:val="0"/>
+          <w14:ligatures w14:val="none"/>
+        </w:rPr>
+      </w:pPr>
+      <w:r>
+        <w:rPr>
+          <w:rFonts w:ascii="Times New Roman" w:eastAsia="Times New Roman" w:hAnsi="Times New Roman" w:cs="Times New Roman"/>
+          <w:kern w:val="0"/>
+          <w14:ligatures w14:val="none"/>
+        </w:rPr>
+        <w:t xml:space="preserve">Approximate difficulty; </w:t>
+      </w:r>
+    </w:p>
+    <w:p>
+      <w:pPr>
+        <w:numPr>
+          <w:ilvl w:val="0"/>
+          <w:numId w:val="5"/>
+        </w:numPr>
+        <w:spacing w:before="100" w:beforeAutospacing="1" w:after="100" w:afterAutospacing="1" w:line="360" w:lineRule="auto"/>
+        <w:rPr>
+          <w:rFonts w:ascii="Times New Roman" w:eastAsia="Times New Roman" w:hAnsi="Times New Roman" w:cs="Times New Roman"/>
+          <w:kern w:val="0"/>
+          <w14:ligatures w14:val="none"/>
+        </w:rPr>
+      </w:pPr>
+      <w:r>
+        <w:rPr>
+          <w:rFonts w:ascii="Times New Roman" w:eastAsia="Times New Roman" w:hAnsi="Times New Roman" w:cs="Times New Roman"/>
+          <w:kern w:val="0"/>
+          <w14:ligatures w14:val="none"/>
+        </w:rPr>
+        <w:t xml:space="preserve">Word count; </w:t>
+      </w:r>
+    </w:p>
+    <w:p>
+      <w:pPr>
+        <w:numPr>
+          <w:ilvl w:val="0"/>
+          <w:numId w:val="5"/>
+        </w:numPr>
+        <w:spacing w:before="100" w:beforeAutospacing="1" w:after="100" w:afterAutospacing="1" w:line="360" w:lineRule="auto"/>
+        <w:rPr>
+          <w:rFonts w:ascii="Times New Roman" w:eastAsia="Times New Roman" w:hAnsi="Times New Roman" w:cs="Times New Roman"/>
+          <w:kern w:val="0"/>
+          <w14:ligatures w14:val="none"/>
+        </w:rPr>
+      </w:pPr>
+      <w:r>
+        <w:rPr>
+          <w:rFonts w:ascii="Times New Roman" w:eastAsia="Times New Roman" w:hAnsi="Times New Roman" w:cs="Times New Roman"/>
+          <w:kern w:val="0"/>
+          <w14:ligatures w14:val="none"/>
+        </w:rPr>
+        <w:t xml:space="preserve">Source or generation information. </w:t>
+      </w:r>
+    </w:p>
+    <w:p>
+      <w:pPr>
+        <w:spacing w:before="100" w:beforeAutospacing="1" w:after="100" w:afterAutospacing="1" w:line="360" w:lineRule="auto"/>
+        <w:outlineLvl w:val="2"/>
+        <w:rPr>
+          <w:rFonts w:ascii="Times New Roman" w:eastAsia="Times New Roman" w:hAnsi="Times New Roman" w:cs="Times New Roman"/>
+          <w:b/>
+          <w:bCs/>
+          <w:kern w:val="0"/>
+          <w:sz w:val="27"/>
+          <w:szCs w:val="27"/>
+          <w14:ligatures w14:val="none"/>
+        </w:rPr>
+      </w:pPr>
+      <w:r>
+        <w:rPr>
+          <w:rFonts w:ascii="Times New Roman" w:eastAsia="Times New Roman" w:hAnsi="Times New Roman" w:cs="Times New Roman"/>
+          <w:b/>
+          <w:bCs/>
+          <w:kern w:val="0"/>
+          <w:sz w:val="27"/>
+          <w:szCs w:val="27"/>
+          <w14:ligatures w14:val="none"/>
+        </w:rPr>
+        <w:t>3.4 Randomization and Condition Assignment</w:t>
+      </w:r>
+    </w:p>
+    <w:p>
+      <w:pPr>
+        <w:spacing w:before="100" w:beforeAutospacing="1" w:after="100" w:afterAutospacing="1" w:line="360" w:lineRule="auto"/>
+        <w:rPr>
+          <w:rFonts w:ascii="Times New Roman" w:eastAsia="Times New Roman" w:hAnsi="Times New Roman" w:cs="Times New Roman"/>
+          <w:kern w:val="0"/>
+          <w14:ligatures w14:val="none"/>
+        </w:rPr>
+      </w:pPr>
+      <w:r>
+        <w:rPr>
+          <w:rFonts w:ascii="Times New Roman" w:eastAsia="Times New Roman" w:hAnsi="Times New Roman" w:cs="Times New Roman"/>
+          <w:kern w:val="0"/>
+          <w14:ligatures w14:val="none"/>
+        </w:rPr>
+        <w:t xml:space="preserve">Each participant reads a randomized subset of </w:t>
+      </w:r>
+      <w:r>
+        <w:rPr>
+          <w:rFonts w:ascii="Times New Roman" w:eastAsia="Times New Roman" w:hAnsi="Times New Roman" w:cs="Times New Roman"/>
+          <w:b/>
+          <w:bCs/>
+          <w:kern w:val="0"/>
+          <w14:ligatures w14:val="none"/>
+        </w:rPr>
+        <w:t>9–12 passages</w:t>
+      </w:r>
+      <w:r>
+        <w:rPr>
+          <w:rFonts w:ascii="Times New Roman" w:eastAsia="Times New Roman" w:hAnsi="Times New Roman" w:cs="Times New Roman"/>
+          <w:kern w:val="0"/>
+          <w14:ligatures w14:val="none"/>
+        </w:rPr>
+        <w:t xml:space="preserve"> selected from the 20 topic triplets.</w:t>
+      </w:r>
+    </w:p>
+    <w:p>
+      <w:pPr>
+        <w:spacing w:before="100" w:beforeAutospacing="1" w:after="100" w:afterAutospacing="1" w:line="360" w:lineRule="auto"/>
+        <w:rPr>
+          <w:rFonts w:ascii="Times New Roman" w:eastAsia="Times New Roman" w:hAnsi="Times New Roman" w:cs="Times New Roman"/>
+          <w:kern w:val="0"/>
+          <w14:ligatures w14:val="none"/>
+        </w:rPr>
+      </w:pPr>
+      <w:r>
+        <w:rPr>
+          <w:rFonts w:ascii="Times New Roman" w:eastAsia="Times New Roman" w:hAnsi="Times New Roman" w:cs="Times New Roman"/>
+          <w:kern w:val="0"/>
+          <w14:ligatures w14:val="none"/>
+        </w:rPr>
+        <w:t>For every selected topic, the system presents only one of its three versions. A participant therefore does not read the human, AI, and hybrid versions of the same topic during the same session.</w:t>
+      </w:r>
+    </w:p>
+    <w:p>
+      <w:pPr>
+        <w:spacing w:before="100" w:beforeAutospacing="1" w:after="100" w:afterAutospacing="1" w:line="360" w:lineRule="auto"/>
+        <w:rPr>
+          <w:rFonts w:ascii="Times New Roman" w:eastAsia="Times New Roman" w:hAnsi="Times New Roman" w:cs="Times New Roman"/>
+          <w:kern w:val="0"/>
+          <w14:ligatures w14:val="none"/>
+        </w:rPr>
+      </w:pPr>
+      <w:r>
+        <w:rPr>
+          <w:rFonts w:ascii="Times New Roman" w:eastAsia="Times New Roman" w:hAnsi="Times New Roman" w:cs="Times New Roman"/>
+          <w:kern w:val="0"/>
+          <w14:ligatures w14:val="none"/>
+        </w:rPr>
+        <w:t>The selected passages are distributed across the three conditions as evenly as possible. For example, a nine-passage session may contain three passages from each condition, while a twelve-passage session may contain four from each condition. Sessions containing ten or eleven passages use an approximately balanced allocation.</w:t>
+      </w:r>
+    </w:p>
+    <w:p>
+      <w:pPr>
+        <w:spacing w:before="100" w:beforeAutospacing="1" w:after="100" w:afterAutospacing="1" w:line="360" w:lineRule="auto"/>
+        <w:rPr>
+          <w:rFonts w:ascii="Times New Roman" w:eastAsia="Times New Roman" w:hAnsi="Times New Roman" w:cs="Times New Roman"/>
+          <w:kern w:val="0"/>
+          <w14:ligatures w14:val="none"/>
+        </w:rPr>
+      </w:pPr>
+      <w:r>
+        <w:rPr>
+          <w:rFonts w:ascii="Times New Roman" w:eastAsia="Times New Roman" w:hAnsi="Times New Roman" w:cs="Times New Roman"/>
+          <w:kern w:val="0"/>
+          <w14:ligatures w14:val="none"/>
+        </w:rPr>
+        <w:t>Both topic selection and passage order are randomized. Across the full participant sample, condition assignment is counterbalanced so that each topic can be evaluated in all three conditions at approximately comparable frequencies.</w:t>
+      </w:r>
+    </w:p>
+    <w:p>
+      <w:pPr>
+        <w:spacing w:before="100" w:beforeAutospacing="1" w:after="100" w:afterAutospacing="1" w:line="360" w:lineRule="auto"/>
+        <w:rPr>
+          <w:rFonts w:ascii="Times New Roman" w:eastAsia="Times New Roman" w:hAnsi="Times New Roman" w:cs="Times New Roman"/>
+          <w:kern w:val="0"/>
+          <w14:ligatures w14:val="none"/>
+        </w:rPr>
+      </w:pPr>
+      <w:r>
+        <w:rPr>
+          <w:rFonts w:ascii="Times New Roman" w:eastAsia="Times New Roman" w:hAnsi="Times New Roman" w:cs="Times New Roman"/>
+          <w:kern w:val="0"/>
+          <w14:ligatures w14:val="none"/>
+        </w:rPr>
+        <w:t>This design reduces three potential confounds:</w:t>
+      </w:r>
+    </w:p>
+    <w:p>
+      <w:pPr>
+        <w:numPr>
+          <w:ilvl w:val="0"/>
+          <w:numId w:val="6"/>
+        </w:numPr>
+        <w:spacing w:before="100" w:beforeAutospacing="1" w:after="100" w:afterAutospacing="1" w:line="360" w:lineRule="auto"/>
+        <w:rPr>
+          <w:rFonts w:ascii="Times New Roman" w:eastAsia="Times New Roman" w:hAnsi="Times New Roman" w:cs="Times New Roman"/>
+          <w:kern w:val="0"/>
+          <w14:ligatures w14:val="none"/>
+        </w:rPr>
+      </w:pPr>
+      <w:r>
+        <w:rPr>
+          <w:rFonts w:ascii="Times New Roman" w:eastAsia="Times New Roman" w:hAnsi="Times New Roman" w:cs="Times New Roman"/>
+          <w:b/>
+          <w:bCs/>
+          <w:kern w:val="0"/>
+          <w14:ligatures w14:val="none"/>
+        </w:rPr>
+        <w:t>Repetition effects</w:t>
+      </w:r>
+      <w:r>
+        <w:rPr>
+          <w:rFonts w:ascii="Times New Roman" w:eastAsia="Times New Roman" w:hAnsi="Times New Roman" w:cs="Times New Roman"/>
+          <w:kern w:val="0"/>
+          <w14:ligatures w14:val="none"/>
+        </w:rPr>
+        <w:t xml:space="preserve">, because the same topic is not presented more than once to one participant; </w:t>
+      </w:r>
+    </w:p>
+    <w:p>
+      <w:pPr>
+        <w:numPr>
+          <w:ilvl w:val="0"/>
+          <w:numId w:val="6"/>
+        </w:numPr>
+        <w:spacing w:before="100" w:beforeAutospacing="1" w:after="100" w:afterAutospacing="1" w:line="360" w:lineRule="auto"/>
+        <w:rPr>
+          <w:rFonts w:ascii="Times New Roman" w:eastAsia="Times New Roman" w:hAnsi="Times New Roman" w:cs="Times New Roman"/>
+          <w:kern w:val="0"/>
+          <w14:ligatures w14:val="none"/>
+        </w:rPr>
+      </w:pPr>
+      <w:r>
+        <w:rPr>
+          <w:rFonts w:ascii="Times New Roman" w:eastAsia="Times New Roman" w:hAnsi="Times New Roman" w:cs="Times New Roman"/>
+          <w:b/>
+          <w:bCs/>
+          <w:kern w:val="0"/>
+          <w14:ligatures w14:val="none"/>
+        </w:rPr>
+        <w:t>Direct-comparison effects</w:t>
+      </w:r>
+      <w:r>
+        <w:rPr>
+          <w:rFonts w:ascii="Times New Roman" w:eastAsia="Times New Roman" w:hAnsi="Times New Roman" w:cs="Times New Roman"/>
+          <w:kern w:val="0"/>
+          <w14:ligatures w14:val="none"/>
+        </w:rPr>
+        <w:t xml:space="preserve">, because participants cannot compare three near-equivalent versions; </w:t>
+      </w:r>
+    </w:p>
+    <w:p>
+      <w:pPr>
+        <w:numPr>
+          <w:ilvl w:val="0"/>
+          <w:numId w:val="6"/>
+        </w:numPr>
+        <w:spacing w:before="100" w:beforeAutospacing="1" w:after="100" w:afterAutospacing="1" w:line="360" w:lineRule="auto"/>
+        <w:rPr>
+          <w:rFonts w:ascii="Times New Roman" w:eastAsia="Times New Roman" w:hAnsi="Times New Roman" w:cs="Times New Roman"/>
+          <w:kern w:val="0"/>
+          <w14:ligatures w14:val="none"/>
+        </w:rPr>
+      </w:pPr>
+      <w:r>
+        <w:rPr>
+          <w:rFonts w:ascii="Times New Roman" w:eastAsia="Times New Roman" w:hAnsi="Times New Roman" w:cs="Times New Roman"/>
+          <w:b/>
+          <w:bCs/>
+          <w:kern w:val="0"/>
+          <w14:ligatures w14:val="none"/>
+        </w:rPr>
+        <w:t>Topic effects</w:t>
+      </w:r>
+      <w:r>
+        <w:rPr>
+          <w:rFonts w:ascii="Times New Roman" w:eastAsia="Times New Roman" w:hAnsi="Times New Roman" w:cs="Times New Roman"/>
+          <w:kern w:val="0"/>
+          <w14:ligatures w14:val="none"/>
+        </w:rPr>
+        <w:t xml:space="preserve">, because different participants encounter each topic under different authorship conditions. </w:t>
+      </w:r>
+    </w:p>
+    <w:p>
+      <w:pPr>
+        <w:spacing w:before="100" w:beforeAutospacing="1" w:after="100" w:afterAutospacing="1" w:line="360" w:lineRule="auto"/>
+        <w:outlineLvl w:val="2"/>
+        <w:rPr>
+          <w:rFonts w:ascii="Times New Roman" w:eastAsia="Times New Roman" w:hAnsi="Times New Roman" w:cs="Times New Roman"/>
+          <w:b/>
+          <w:bCs/>
+          <w:kern w:val="0"/>
+          <w:sz w:val="27"/>
+          <w:szCs w:val="27"/>
+          <w14:ligatures w14:val="none"/>
+        </w:rPr>
+      </w:pPr>
+      <w:r>
+        <w:rPr>
+          <w:rFonts w:ascii="Times New Roman" w:eastAsia="Times New Roman" w:hAnsi="Times New Roman" w:cs="Times New Roman"/>
+          <w:b/>
+          <w:bCs/>
+          <w:kern w:val="0"/>
+          <w:sz w:val="27"/>
+          <w:szCs w:val="27"/>
+          <w14:ligatures w14:val="none"/>
+        </w:rPr>
+        <w:lastRenderedPageBreak/>
+        <w:t>3.5 Experimental Procedure</w:t>
+      </w:r>
+    </w:p>
+    <w:p>
+      <w:pPr>
+        <w:spacing w:before="100" w:beforeAutospacing="1" w:after="100" w:afterAutospacing="1" w:line="360" w:lineRule="auto"/>
+        <w:rPr>
+          <w:rFonts w:ascii="Times New Roman" w:eastAsia="Times New Roman" w:hAnsi="Times New Roman" w:cs="Times New Roman"/>
+          <w:kern w:val="0"/>
+          <w14:ligatures w14:val="none"/>
+        </w:rPr>
+      </w:pPr>
+      <w:r>
+        <w:rPr>
+          <w:rFonts w:ascii="Times New Roman" w:eastAsia="Times New Roman" w:hAnsi="Times New Roman" w:cs="Times New Roman"/>
+          <w:kern w:val="0"/>
+          <w14:ligatures w14:val="none"/>
+        </w:rPr>
+        <w:t>Each participant completes the experiment individually through a web browser.</w:t>
+      </w:r>
+    </w:p>
+    <w:p>
+      <w:pPr>
+        <w:spacing w:before="100" w:beforeAutospacing="1" w:after="100" w:afterAutospacing="1" w:line="360" w:lineRule="auto"/>
+        <w:outlineLvl w:val="3"/>
+        <w:rPr>
+          <w:rFonts w:ascii="Times New Roman" w:eastAsia="Times New Roman" w:hAnsi="Times New Roman" w:cs="Times New Roman"/>
+          <w:b/>
+          <w:bCs/>
+          <w:kern w:val="0"/>
+          <w14:ligatures w14:val="none"/>
+        </w:rPr>
+      </w:pPr>
+      <w:r>
+        <w:rPr>
+          <w:rFonts w:ascii="Times New Roman" w:eastAsia="Times New Roman" w:hAnsi="Times New Roman" w:cs="Times New Roman"/>
+          <w:b/>
+          <w:bCs/>
+          <w:kern w:val="0"/>
+          <w14:ligatures w14:val="none"/>
+        </w:rPr>
+        <w:t>3.5.1 Background questionnaire</w:t>
+      </w:r>
+    </w:p>
+    <w:p>
+      <w:pPr>
+        <w:spacing w:before="100" w:beforeAutospacing="1" w:after="100" w:afterAutospacing="1" w:line="360" w:lineRule="auto"/>
+        <w:rPr>
+          <w:rFonts w:ascii="Times New Roman" w:eastAsia="Times New Roman" w:hAnsi="Times New Roman" w:cs="Times New Roman"/>
+          <w:kern w:val="0"/>
+          <w14:ligatures w14:val="none"/>
+        </w:rPr>
+      </w:pPr>
+      <w:r>
+        <w:rPr>
+          <w:rFonts w:ascii="Times New Roman" w:eastAsia="Times New Roman" w:hAnsi="Times New Roman" w:cs="Times New Roman"/>
+          <w:kern w:val="0"/>
+          <w14:ligatures w14:val="none"/>
+        </w:rPr>
+        <w:t>Participants first provide the bilingual-background and AI-familiarity information described above.</w:t>
+      </w:r>
+    </w:p>
+    <w:p>
+      <w:pPr>
+        <w:spacing w:before="100" w:beforeAutospacing="1" w:after="100" w:afterAutospacing="1" w:line="360" w:lineRule="auto"/>
+        <w:outlineLvl w:val="3"/>
+        <w:rPr>
+          <w:rFonts w:ascii="Times New Roman" w:eastAsia="Times New Roman" w:hAnsi="Times New Roman" w:cs="Times New Roman"/>
+          <w:b/>
+          <w:bCs/>
+          <w:kern w:val="0"/>
+          <w14:ligatures w14:val="none"/>
+        </w:rPr>
+      </w:pPr>
+      <w:r>
+        <w:rPr>
+          <w:rFonts w:ascii="Times New Roman" w:eastAsia="Times New Roman" w:hAnsi="Times New Roman" w:cs="Times New Roman"/>
+          <w:b/>
+          <w:bCs/>
+          <w:kern w:val="0"/>
+          <w14:ligatures w14:val="none"/>
+        </w:rPr>
+        <w:t>3.5.2 Ready screen and reading stage</w:t>
+      </w:r>
+    </w:p>
+    <w:p>
+      <w:pPr>
+        <w:spacing w:before="100" w:beforeAutospacing="1" w:after="100" w:afterAutospacing="1" w:line="360" w:lineRule="auto"/>
+        <w:rPr>
+          <w:rFonts w:ascii="Times New Roman" w:eastAsia="Times New Roman" w:hAnsi="Times New Roman" w:cs="Times New Roman"/>
+          <w:kern w:val="0"/>
+          <w14:ligatures w14:val="none"/>
+        </w:rPr>
+      </w:pPr>
+      <w:r>
+        <w:rPr>
+          <w:rFonts w:ascii="Times New Roman" w:eastAsia="Times New Roman" w:hAnsi="Times New Roman" w:cs="Times New Roman"/>
+          <w:kern w:val="0"/>
+          <w14:ligatures w14:val="none"/>
+        </w:rPr>
+        <w:t>Before each passage, a ready screen or fixation symbol is presented. The participant presses a designated key when prepared to begin. The passage is then displayed without authorship information.</w:t>
+      </w:r>
+    </w:p>
+    <w:p>
+      <w:pPr>
+        <w:spacing w:before="100" w:beforeAutospacing="1" w:after="100" w:afterAutospacing="1" w:line="360" w:lineRule="auto"/>
+        <w:rPr>
+          <w:rFonts w:ascii="Times New Roman" w:eastAsia="Times New Roman" w:hAnsi="Times New Roman" w:cs="Times New Roman"/>
+          <w:kern w:val="0"/>
+          <w14:ligatures w14:val="none"/>
+        </w:rPr>
+      </w:pPr>
+      <w:r>
+        <w:rPr>
+          <w:rFonts w:ascii="Times New Roman" w:eastAsia="Times New Roman" w:hAnsi="Times New Roman" w:cs="Times New Roman"/>
+          <w:kern w:val="0"/>
+          <w14:ligatures w14:val="none"/>
+        </w:rPr>
+        <w:t>Reading time is recorded from the appearance of the passage until the participant indicates that reading is complete.</w:t>
+      </w:r>
+    </w:p>
+    <w:p>
+      <w:pPr>
+        <w:spacing w:before="100" w:beforeAutospacing="1" w:after="100" w:afterAutospacing="1" w:line="360" w:lineRule="auto"/>
+        <w:outlineLvl w:val="3"/>
+        <w:rPr>
+          <w:rFonts w:ascii="Times New Roman" w:eastAsia="Times New Roman" w:hAnsi="Times New Roman" w:cs="Times New Roman"/>
+          <w:b/>
+          <w:bCs/>
+          <w:kern w:val="0"/>
+          <w14:ligatures w14:val="none"/>
+        </w:rPr>
+      </w:pPr>
+      <w:r>
+        <w:rPr>
+          <w:rFonts w:ascii="Times New Roman" w:eastAsia="Times New Roman" w:hAnsi="Times New Roman" w:cs="Times New Roman"/>
+          <w:b/>
+          <w:bCs/>
+          <w:kern w:val="0"/>
+          <w14:ligatures w14:val="none"/>
+        </w:rPr>
+        <w:t>3.5.3 Authorship-perception task</w:t>
+      </w:r>
+    </w:p>
+    <w:p>
+      <w:pPr>
+        <w:spacing w:before="100" w:beforeAutospacing="1" w:after="100" w:afterAutospacing="1" w:line="360" w:lineRule="auto"/>
+        <w:rPr>
+          <w:rFonts w:ascii="Times New Roman" w:eastAsia="Times New Roman" w:hAnsi="Times New Roman" w:cs="Times New Roman"/>
+          <w:kern w:val="0"/>
+          <w14:ligatures w14:val="none"/>
+        </w:rPr>
+      </w:pPr>
+      <w:r>
+        <w:rPr>
+          <w:rFonts w:ascii="Times New Roman" w:eastAsia="Times New Roman" w:hAnsi="Times New Roman" w:cs="Times New Roman"/>
+          <w:kern w:val="0"/>
+          <w14:ligatures w14:val="none"/>
+        </w:rPr>
+        <w:t>After reading, the participant answers:</w:t>
+      </w:r>
+    </w:p>
+    <w:p>
+      <w:pPr>
+        <w:spacing w:before="100" w:beforeAutospacing="1" w:after="100" w:afterAutospacing="1" w:line="360" w:lineRule="auto"/>
+        <w:rPr>
+          <w:rFonts w:ascii="Times New Roman" w:eastAsia="Times New Roman" w:hAnsi="Times New Roman" w:cs="Times New Roman"/>
+          <w:kern w:val="0"/>
+          <w14:ligatures w14:val="none"/>
+        </w:rPr>
+      </w:pPr>
+      <w:r>
+        <w:rPr>
+          <w:rFonts w:ascii="Times New Roman" w:eastAsia="Times New Roman" w:hAnsi="Times New Roman" w:cs="Times New Roman"/>
+          <w:kern w:val="0"/>
+          <w14:ligatures w14:val="none"/>
+        </w:rPr>
+        <w:t>Who do you think wrote this text?</w:t>
+      </w:r>
+    </w:p>
+    <w:p>
+      <w:pPr>
+        <w:spacing w:before="100" w:beforeAutospacing="1" w:after="100" w:afterAutospacing="1" w:line="360" w:lineRule="auto"/>
+        <w:rPr>
+          <w:rFonts w:ascii="Times New Roman" w:eastAsia="Times New Roman" w:hAnsi="Times New Roman" w:cs="Times New Roman"/>
+          <w:kern w:val="0"/>
+          <w14:ligatures w14:val="none"/>
+        </w:rPr>
+      </w:pPr>
+      <w:r>
+        <w:rPr>
+          <w:rFonts w:ascii="Times New Roman" w:eastAsia="Times New Roman" w:hAnsi="Times New Roman" w:cs="Times New Roman"/>
+          <w:kern w:val="0"/>
+          <w14:ligatures w14:val="none"/>
+        </w:rPr>
+        <w:t>The available responses are:</w:t>
+      </w:r>
+    </w:p>
+    <w:p>
+      <w:pPr>
+        <w:numPr>
+          <w:ilvl w:val="0"/>
+          <w:numId w:val="7"/>
+        </w:numPr>
+        <w:spacing w:before="100" w:beforeAutospacing="1" w:after="100" w:afterAutospacing="1" w:line="360" w:lineRule="auto"/>
+        <w:rPr>
+          <w:rFonts w:ascii="Times New Roman" w:eastAsia="Times New Roman" w:hAnsi="Times New Roman" w:cs="Times New Roman"/>
+          <w:kern w:val="0"/>
+          <w14:ligatures w14:val="none"/>
+        </w:rPr>
+      </w:pPr>
+      <w:r>
+        <w:rPr>
+          <w:rFonts w:ascii="Times New Roman" w:eastAsia="Times New Roman" w:hAnsi="Times New Roman" w:cs="Times New Roman"/>
+          <w:kern w:val="0"/>
+          <w14:ligatures w14:val="none"/>
+        </w:rPr>
+        <w:t xml:space="preserve">Human-written; </w:t>
+      </w:r>
+    </w:p>
+    <w:p>
+      <w:pPr>
+        <w:numPr>
+          <w:ilvl w:val="0"/>
+          <w:numId w:val="7"/>
+        </w:numPr>
+        <w:spacing w:before="100" w:beforeAutospacing="1" w:after="100" w:afterAutospacing="1" w:line="360" w:lineRule="auto"/>
+        <w:rPr>
+          <w:rFonts w:ascii="Times New Roman" w:eastAsia="Times New Roman" w:hAnsi="Times New Roman" w:cs="Times New Roman"/>
+          <w:kern w:val="0"/>
+          <w14:ligatures w14:val="none"/>
+        </w:rPr>
+      </w:pPr>
+      <w:r>
+        <w:rPr>
+          <w:rFonts w:ascii="Times New Roman" w:eastAsia="Times New Roman" w:hAnsi="Times New Roman" w:cs="Times New Roman"/>
+          <w:kern w:val="0"/>
+          <w14:ligatures w14:val="none"/>
+        </w:rPr>
+        <w:t xml:space="preserve">AI-generated; </w:t>
+      </w:r>
+    </w:p>
+    <w:p>
+      <w:pPr>
+        <w:numPr>
+          <w:ilvl w:val="0"/>
+          <w:numId w:val="7"/>
+        </w:numPr>
+        <w:spacing w:before="100" w:beforeAutospacing="1" w:after="100" w:afterAutospacing="1" w:line="360" w:lineRule="auto"/>
+        <w:rPr>
+          <w:rFonts w:ascii="Times New Roman" w:eastAsia="Times New Roman" w:hAnsi="Times New Roman" w:cs="Times New Roman"/>
+          <w:kern w:val="0"/>
+          <w14:ligatures w14:val="none"/>
+        </w:rPr>
+      </w:pPr>
+      <w:r>
+        <w:rPr>
+          <w:rFonts w:ascii="Times New Roman" w:eastAsia="Times New Roman" w:hAnsi="Times New Roman" w:cs="Times New Roman"/>
+          <w:kern w:val="0"/>
+          <w14:ligatures w14:val="none"/>
+        </w:rPr>
+        <w:t xml:space="preserve">Human-written with AI editing; </w:t>
+      </w:r>
+    </w:p>
+    <w:p>
+      <w:pPr>
+        <w:numPr>
+          <w:ilvl w:val="0"/>
+          <w:numId w:val="7"/>
+        </w:numPr>
+        <w:spacing w:before="100" w:beforeAutospacing="1" w:after="100" w:afterAutospacing="1" w:line="360" w:lineRule="auto"/>
+        <w:rPr>
+          <w:rFonts w:ascii="Times New Roman" w:eastAsia="Times New Roman" w:hAnsi="Times New Roman" w:cs="Times New Roman"/>
+          <w:kern w:val="0"/>
+          <w14:ligatures w14:val="none"/>
+        </w:rPr>
+      </w:pPr>
+      <w:r>
+        <w:rPr>
+          <w:rFonts w:ascii="Times New Roman" w:eastAsia="Times New Roman" w:hAnsi="Times New Roman" w:cs="Times New Roman"/>
+          <w:kern w:val="0"/>
+          <w14:ligatures w14:val="none"/>
+        </w:rPr>
+        <w:t xml:space="preserve">Not sure. </w:t>
+      </w:r>
+    </w:p>
+    <w:p>
+      <w:pPr>
+        <w:spacing w:before="100" w:beforeAutospacing="1" w:after="100" w:afterAutospacing="1" w:line="360" w:lineRule="auto"/>
+        <w:rPr>
+          <w:rFonts w:ascii="Times New Roman" w:eastAsia="Times New Roman" w:hAnsi="Times New Roman" w:cs="Times New Roman"/>
+          <w:kern w:val="0"/>
+          <w14:ligatures w14:val="none"/>
+        </w:rPr>
+      </w:pPr>
+      <w:r>
+        <w:rPr>
+          <w:rFonts w:ascii="Times New Roman" w:eastAsia="Times New Roman" w:hAnsi="Times New Roman" w:cs="Times New Roman"/>
+          <w:kern w:val="0"/>
+          <w14:ligatures w14:val="none"/>
+        </w:rPr>
+        <w:t>The participant also rates the probability that the text was AI-generated on a five-point scale. Classification choice, accuracy, and reaction time are recorded.</w:t>
+      </w:r>
+    </w:p>
+    <w:p>
+      <w:pPr>
+        <w:spacing w:before="100" w:beforeAutospacing="1" w:after="100" w:afterAutospacing="1" w:line="360" w:lineRule="auto"/>
+        <w:outlineLvl w:val="3"/>
+        <w:rPr>
+          <w:rFonts w:ascii="Times New Roman" w:eastAsia="Times New Roman" w:hAnsi="Times New Roman" w:cs="Times New Roman"/>
+          <w:b/>
+          <w:bCs/>
+          <w:kern w:val="0"/>
+          <w14:ligatures w14:val="none"/>
+        </w:rPr>
+      </w:pPr>
+      <w:r>
+        <w:rPr>
+          <w:rFonts w:ascii="Times New Roman" w:eastAsia="Times New Roman" w:hAnsi="Times New Roman" w:cs="Times New Roman"/>
+          <w:b/>
+          <w:bCs/>
+          <w:kern w:val="0"/>
+          <w14:ligatures w14:val="none"/>
+        </w:rPr>
+        <w:t>3.5.4 Psycholinguistic-</w:t>
+      </w:r>
+      <w:r>
+        <w:rPr>
+          <w:rFonts w:ascii="Times New Roman" w:eastAsia="Times New Roman" w:hAnsi="Times New Roman" w:cs="Times New Roman" w:hint="eastAsia"/>
+          <w:b/>
+          <w:bCs/>
+          <w:kern w:val="0"/>
+          <w14:ligatures w14:val="none"/>
+        </w:rPr>
+        <w:t xml:space="preserve">z z </w:t>
+      </w:r>
+      <w:proofErr w:type="spellStart"/>
+      <w:r>
+        <w:rPr>
+          <w:rFonts w:ascii="Times New Roman" w:eastAsia="Times New Roman" w:hAnsi="Times New Roman" w:cs="Times New Roman" w:hint="eastAsia"/>
+          <w:b/>
+          <w:bCs/>
+          <w:kern w:val="0"/>
+          <w14:ligatures w14:val="none"/>
+        </w:rPr>
+        <w:t>z</w:t>
+      </w:r>
+      <w:proofErr w:type="spellEnd"/>
+      <w:r>
+        <w:rPr>
+          <w:rFonts w:ascii="Times New Roman" w:eastAsia="Times New Roman" w:hAnsi="Times New Roman" w:cs="Times New Roman" w:hint="eastAsia"/>
+          <w:b/>
+          <w:bCs/>
+          <w:kern w:val="0"/>
+          <w14:ligatures w14:val="none"/>
+        </w:rPr>
+        <w:t xml:space="preserve"> </w:t>
+      </w:r>
+      <w:proofErr w:type="spellStart"/>
+      <w:r>
+        <w:rPr>
+          <w:rFonts w:ascii="Times New Roman" w:eastAsia="Times New Roman" w:hAnsi="Times New Roman" w:cs="Times New Roman" w:hint="eastAsia"/>
+          <w:b/>
+          <w:bCs/>
+          <w:kern w:val="0"/>
+          <w14:ligatures w14:val="none"/>
+        </w:rPr>
+        <w:t>z</w:t>
+      </w:r>
+      <w:proofErr w:type="spellEnd"/>
+      <w:r>
+        <w:rPr>
+          <w:rFonts w:ascii="Times New Roman" w:eastAsia="Times New Roman" w:hAnsi="Times New Roman" w:cs="Times New Roman" w:hint="eastAsia"/>
+          <w:b/>
+          <w:bCs/>
+          <w:kern w:val="0"/>
+          <w14:ligatures w14:val="none"/>
+        </w:rPr>
+        <w:t xml:space="preserve"> </w:t>
+      </w:r>
+      <w:proofErr w:type="spellStart"/>
+      <w:r>
+        <w:rPr>
+          <w:rFonts w:ascii="Times New Roman" w:eastAsia="Times New Roman" w:hAnsi="Times New Roman" w:cs="Times New Roman" w:hint="eastAsia"/>
+          <w:b/>
+          <w:bCs/>
+          <w:kern w:val="0"/>
+          <w14:ligatures w14:val="none"/>
+        </w:rPr>
+        <w:t>z</w:t>
+      </w:r>
+      <w:proofErr w:type="spellEnd"/>
+      <w:r>
+        <w:rPr>
+          <w:rFonts w:ascii="Times New Roman" w:eastAsia="Times New Roman" w:hAnsi="Times New Roman" w:cs="Times New Roman" w:hint="eastAsia"/>
+          <w:b/>
+          <w:bCs/>
+          <w:kern w:val="0"/>
+          <w14:ligatures w14:val="none"/>
+        </w:rPr>
+        <w:t xml:space="preserve"> </w:t>
+      </w:r>
+      <w:proofErr w:type="spellStart"/>
+      <w:r>
+        <w:rPr>
+          <w:rFonts w:ascii="Times New Roman" w:eastAsia="Times New Roman" w:hAnsi="Times New Roman" w:cs="Times New Roman" w:hint="eastAsia"/>
+          <w:b/>
+          <w:bCs/>
+          <w:kern w:val="0"/>
+          <w14:ligatures w14:val="none"/>
+        </w:rPr>
+        <w:t>z</w:t>
+      </w:r>
+      <w:proofErr w:type="spellEnd"/>
+      <w:r>
+        <w:rPr>
+          <w:rFonts w:ascii="Times New Roman" w:eastAsia="Times New Roman" w:hAnsi="Times New Roman" w:cs="Times New Roman" w:hint="eastAsia"/>
+          <w:b/>
+          <w:bCs/>
+          <w:kern w:val="0"/>
+          <w14:ligatures w14:val="none"/>
+        </w:rPr>
+        <w:t xml:space="preserve"> </w:t>
+      </w:r>
+      <w:proofErr w:type="spellStart"/>
+      <w:r>
+        <w:rPr>
+          <w:rFonts w:ascii="Times New Roman" w:eastAsia="Times New Roman" w:hAnsi="Times New Roman" w:cs="Times New Roman" w:hint="eastAsia"/>
+          <w:b/>
+          <w:bCs/>
+          <w:kern w:val="0"/>
+          <w14:ligatures w14:val="none"/>
+        </w:rPr>
+        <w:t>z</w:t>
+      </w:r>
+      <w:proofErr w:type="spellEnd"/>
+      <w:r>
+        <w:rPr>
+          <w:rFonts w:ascii="Times New Roman" w:eastAsia="Times New Roman" w:hAnsi="Times New Roman" w:cs="Times New Roman" w:hint="eastAsia"/>
+          <w:b/>
+          <w:bCs/>
+          <w:kern w:val="0"/>
+          <w14:ligatures w14:val="none"/>
+        </w:rPr>
+        <w:t xml:space="preserve"> </w:t>
+      </w:r>
+      <w:proofErr w:type="spellStart"/>
+      <w:r>
+        <w:rPr>
+          <w:rFonts w:ascii="Times New Roman" w:eastAsia="Times New Roman" w:hAnsi="Times New Roman" w:cs="Times New Roman" w:hint="eastAsia"/>
+          <w:b/>
+          <w:bCs/>
+          <w:kern w:val="0"/>
+          <w14:ligatures w14:val="none"/>
+        </w:rPr>
+        <w:t>z</w:t>
+      </w:r>
+      <w:r>
+        <w:rPr>
+          <w:rFonts w:ascii="Times New Roman" w:eastAsia="Times New Roman" w:hAnsi="Times New Roman" w:cs="Times New Roman"/>
+          <w:b/>
+          <w:bCs/>
+          <w:kern w:val="0"/>
+          <w14:ligatures w14:val="none"/>
+        </w:rPr>
+        <w:t>cue</w:t>
+      </w:r>
+      <w:proofErr w:type="spellEnd"/>
+      <w:r>
+        <w:rPr>
+          <w:rFonts w:ascii="Times New Roman" w:eastAsia="Times New Roman" w:hAnsi="Times New Roman" w:cs="Times New Roman"/>
+          <w:b/>
+          <w:bCs/>
+          <w:kern w:val="0"/>
+          <w14:ligatures w14:val="none"/>
+        </w:rPr>
+        <w:t xml:space="preserve"> rating</w:t>
+      </w:r>
+    </w:p>
+    <w:p>
+      <w:pPr>
+        <w:spacing w:before="100" w:beforeAutospacing="1" w:after="100" w:afterAutospacing="1" w:line="360" w:lineRule="auto"/>
+        <w:rPr>
+          <w:rFonts w:ascii="Times New Roman" w:eastAsia="Times New Roman" w:hAnsi="Times New Roman" w:cs="Times New Roman"/>
+          <w:kern w:val="0"/>
+          <w14:ligatures w14:val="none"/>
+        </w:rPr>
+      </w:pPr>
+      <w:r>
+        <w:rPr>
+          <w:rFonts w:ascii="Times New Roman" w:eastAsia="Times New Roman" w:hAnsi="Times New Roman" w:cs="Times New Roman"/>
+          <w:kern w:val="0"/>
+          <w14:ligatures w14:val="none"/>
+        </w:rPr>
+        <w:lastRenderedPageBreak/>
+        <w:t>The participant rates the passage on seven five-point Likert scales:</w:t>
+      </w:r>
+    </w:p>
+    <w:p>
+      <w:pPr>
+        <w:numPr>
+          <w:ilvl w:val="0"/>
+          <w:numId w:val="8"/>
+        </w:numPr>
+        <w:spacing w:before="100" w:beforeAutospacing="1" w:after="100" w:afterAutospacing="1" w:line="360" w:lineRule="auto"/>
+        <w:rPr>
+          <w:rFonts w:ascii="Times New Roman" w:eastAsia="Times New Roman" w:hAnsi="Times New Roman" w:cs="Times New Roman"/>
+          <w:kern w:val="0"/>
+          <w14:ligatures w14:val="none"/>
+        </w:rPr>
+      </w:pPr>
+      <w:r>
+        <w:rPr>
+          <w:rFonts w:ascii="Times New Roman" w:eastAsia="Times New Roman" w:hAnsi="Times New Roman" w:cs="Times New Roman"/>
+          <w:kern w:val="0"/>
+          <w14:ligatures w14:val="none"/>
+        </w:rPr>
+        <w:t xml:space="preserve">Fluency; </w:t>
+      </w:r>
+    </w:p>
+    <w:p>
+      <w:pPr>
+        <w:numPr>
+          <w:ilvl w:val="0"/>
+          <w:numId w:val="8"/>
+        </w:numPr>
+        <w:spacing w:before="100" w:beforeAutospacing="1" w:after="100" w:afterAutospacing="1" w:line="360" w:lineRule="auto"/>
+        <w:rPr>
+          <w:rFonts w:ascii="Times New Roman" w:eastAsia="Times New Roman" w:hAnsi="Times New Roman" w:cs="Times New Roman"/>
+          <w:kern w:val="0"/>
+          <w14:ligatures w14:val="none"/>
+        </w:rPr>
+      </w:pPr>
+      <w:r>
+        <w:rPr>
+          <w:rFonts w:ascii="Times New Roman" w:eastAsia="Times New Roman" w:hAnsi="Times New Roman" w:cs="Times New Roman"/>
+          <w:kern w:val="0"/>
+          <w14:ligatures w14:val="none"/>
+        </w:rPr>
+        <w:t xml:space="preserve">Structural regularity; </w:t>
+      </w:r>
+    </w:p>
+    <w:p>
+      <w:pPr>
+        <w:numPr>
+          <w:ilvl w:val="0"/>
+          <w:numId w:val="8"/>
+        </w:numPr>
+        <w:spacing w:before="100" w:beforeAutospacing="1" w:after="100" w:afterAutospacing="1" w:line="360" w:lineRule="auto"/>
+        <w:rPr>
+          <w:rFonts w:ascii="Times New Roman" w:eastAsia="Times New Roman" w:hAnsi="Times New Roman" w:cs="Times New Roman"/>
+          <w:kern w:val="0"/>
+          <w14:ligatures w14:val="none"/>
+        </w:rPr>
+      </w:pPr>
+      <w:r>
+        <w:rPr>
+          <w:rFonts w:ascii="Times New Roman" w:eastAsia="Times New Roman" w:hAnsi="Times New Roman" w:cs="Times New Roman"/>
+          <w:kern w:val="0"/>
+          <w14:ligatures w14:val="none"/>
+        </w:rPr>
+        <w:t xml:space="preserve">Clarity; </w:t>
+      </w:r>
+    </w:p>
+    <w:p>
+      <w:pPr>
+        <w:numPr>
+          <w:ilvl w:val="0"/>
+          <w:numId w:val="8"/>
+        </w:numPr>
+        <w:spacing w:before="100" w:beforeAutospacing="1" w:after="100" w:afterAutospacing="1" w:line="360" w:lineRule="auto"/>
+        <w:rPr>
+          <w:rFonts w:ascii="Times New Roman" w:eastAsia="Times New Roman" w:hAnsi="Times New Roman" w:cs="Times New Roman"/>
+          <w:kern w:val="0"/>
+          <w14:ligatures w14:val="none"/>
+        </w:rPr>
+      </w:pPr>
+      <w:r>
+        <w:rPr>
+          <w:rFonts w:ascii="Times New Roman" w:eastAsia="Times New Roman" w:hAnsi="Times New Roman" w:cs="Times New Roman"/>
+          <w:kern w:val="0"/>
+          <w14:ligatures w14:val="none"/>
+        </w:rPr>
+        <w:t xml:space="preserve">Emotional expression; </w:t>
+      </w:r>
+    </w:p>
+    <w:p>
+      <w:pPr>
+        <w:numPr>
+          <w:ilvl w:val="0"/>
+          <w:numId w:val="8"/>
+        </w:numPr>
+        <w:spacing w:before="100" w:beforeAutospacing="1" w:after="100" w:afterAutospacing="1" w:line="360" w:lineRule="auto"/>
+        <w:rPr>
+          <w:rFonts w:ascii="Times New Roman" w:eastAsia="Times New Roman" w:hAnsi="Times New Roman" w:cs="Times New Roman"/>
+          <w:kern w:val="0"/>
+          <w14:ligatures w14:val="none"/>
+        </w:rPr>
+      </w:pPr>
+      <w:r>
+        <w:rPr>
+          <w:rFonts w:ascii="Times New Roman" w:eastAsia="Times New Roman" w:hAnsi="Times New Roman" w:cs="Times New Roman"/>
+          <w:kern w:val="0"/>
+          <w14:ligatures w14:val="none"/>
+        </w:rPr>
+        <w:t xml:space="preserve">Personal voice; </w:t>
+      </w:r>
+    </w:p>
+    <w:p>
+      <w:pPr>
+        <w:numPr>
+          <w:ilvl w:val="0"/>
+          <w:numId w:val="8"/>
+        </w:numPr>
+        <w:spacing w:before="100" w:beforeAutospacing="1" w:after="100" w:afterAutospacing="1" w:line="360" w:lineRule="auto"/>
+        <w:rPr>
+          <w:rFonts w:ascii="Times New Roman" w:eastAsia="Times New Roman" w:hAnsi="Times New Roman" w:cs="Times New Roman" w:hint="eastAsia"/>
+          <w:kern w:val="0"/>
+          <w14:ligatures w14:val="none"/>
+        </w:rPr>
+      </w:pPr>
+      <w:r>
+        <w:rPr>
+          <w:rFonts w:ascii="Times New Roman" w:eastAsia="Times New Roman" w:hAnsi="Times New Roman" w:cs="Times New Roman"/>
+          <w:kern w:val="0"/>
+          <w14:ligatures w14:val="none"/>
+        </w:rPr>
+        <w:t xml:space="preserve">Genericness; </w:t>
+      </w:r>
+    </w:p>
+    <w:p>
+      <w:pPr>
+        <w:numPr>
+          <w:ilvl w:val="0"/>
+          <w:numId w:val="8"/>
+        </w:numPr>
+        <w:spacing w:before="100" w:beforeAutospacing="1" w:after="100" w:afterAutospacing="1" w:line="360" w:lineRule="auto"/>
+        <w:rPr>
+          <w:rFonts w:ascii="Times New Roman" w:eastAsia="Times New Roman" w:hAnsi="Times New Roman" w:cs="Times New Roman"/>
+          <w:kern w:val="0"/>
+          <w14:ligatures w14:val="none"/>
+        </w:rPr>
+      </w:pPr>
+      <w:r>
+        <w:rPr>
+          <w:rFonts w:ascii="Times New Roman" w:eastAsia="Times New Roman" w:hAnsi="Times New Roman" w:cs="Times New Roman"/>
+          <w:kern w:val="0"/>
+          <w14:ligatures w14:val="none"/>
+        </w:rPr>
+        <w:t xml:space="preserve">Naturalness. </w:t>
+      </w:r>
+    </w:p>
+    <w:p>
+      <w:pPr>
+        <w:spacing w:before="100" w:beforeAutospacing="1" w:after="100" w:afterAutospacing="1" w:line="360" w:lineRule="auto"/>
+        <w:rPr>
+          <w:rFonts w:ascii="Times New Roman" w:eastAsia="Times New Roman" w:hAnsi="Times New Roman" w:cs="Times New Roman"/>
+          <w:kern w:val="0"/>
+          <w14:ligatures w14:val="none"/>
+        </w:rPr>
+      </w:pPr>
+      <w:r>
+        <w:rPr>
+          <w:rFonts w:ascii="Times New Roman" w:eastAsia="Times New Roman" w:hAnsi="Times New Roman" w:cs="Times New Roman"/>
+          <w:kern w:val="0"/>
+          <w14:ligatures w14:val="none"/>
+        </w:rPr>
+        <w:t>These ratings operationalize the otherwise vague impression that a passage “sounds like AI.”</w:t>
+      </w:r>
+    </w:p>
+    <w:p>
+      <w:pPr>
+        <w:spacing w:before="100" w:beforeAutospacing="1" w:after="100" w:afterAutospacing="1" w:line="360" w:lineRule="auto"/>
+        <w:outlineLvl w:val="3"/>
+        <w:rPr>
+          <w:rFonts w:ascii="Times New Roman" w:eastAsia="Times New Roman" w:hAnsi="Times New Roman" w:cs="Times New Roman"/>
+          <w:b/>
+          <w:bCs/>
+          <w:kern w:val="0"/>
+          <w14:ligatures w14:val="none"/>
+        </w:rPr>
+      </w:pPr>
+      <w:r>
+        <w:rPr>
+          <w:rFonts w:ascii="Times New Roman" w:eastAsia="Times New Roman" w:hAnsi="Times New Roman" w:cs="Times New Roman"/>
+          <w:b/>
+          <w:bCs/>
+          <w:kern w:val="0"/>
+          <w14:ligatures w14:val="none"/>
+        </w:rPr>
+        <w:t>3.5.5 Distractor task</w:t>
+      </w:r>
+    </w:p>
+    <w:p>
+      <w:pPr>
+        <w:spacing w:before="100" w:beforeAutospacing="1" w:after="100" w:afterAutospacing="1" w:line="360" w:lineRule="auto"/>
+        <w:rPr>
+          <w:rFonts w:ascii="Times New Roman" w:eastAsia="Times New Roman" w:hAnsi="Times New Roman" w:cs="Times New Roman"/>
+          <w:kern w:val="0"/>
+          <w14:ligatures w14:val="none"/>
+        </w:rPr>
+      </w:pPr>
+      <w:r>
+        <w:rPr>
+          <w:rFonts w:ascii="Times New Roman" w:eastAsia="Times New Roman" w:hAnsi="Times New Roman" w:cs="Times New Roman"/>
+          <w:kern w:val="0"/>
+          <w14:ligatures w14:val="none"/>
+        </w:rPr>
+        <w:t>A brief keyboard-based distractor task follows the ratings. Its purpose is to reduce direct rehearsal of the passage before the memory test.</w:t>
+      </w:r>
+    </w:p>
+    <w:p>
+      <w:pPr>
+        <w:spacing w:before="100" w:beforeAutospacing="1" w:after="100" w:afterAutospacing="1" w:line="360" w:lineRule="auto"/>
+        <w:outlineLvl w:val="3"/>
+        <w:rPr>
+          <w:rFonts w:ascii="Times New Roman" w:eastAsia="Times New Roman" w:hAnsi="Times New Roman" w:cs="Times New Roman"/>
+          <w:b/>
+          <w:bCs/>
+          <w:kern w:val="0"/>
+          <w14:ligatures w14:val="none"/>
+        </w:rPr>
+      </w:pPr>
+      <w:r>
+        <w:rPr>
+          <w:rFonts w:ascii="Times New Roman" w:eastAsia="Times New Roman" w:hAnsi="Times New Roman" w:cs="Times New Roman"/>
+          <w:b/>
+          <w:bCs/>
+          <w:kern w:val="0"/>
+          <w14:ligatures w14:val="none"/>
+        </w:rPr>
+        <w:t>3.5.6 Memory task</w:t>
+      </w:r>
+    </w:p>
+    <w:p>
+      <w:pPr>
+        <w:spacing w:before="100" w:beforeAutospacing="1" w:after="100" w:afterAutospacing="1" w:line="360" w:lineRule="auto"/>
+        <w:rPr>
+          <w:rFonts w:ascii="Times New Roman" w:eastAsia="Times New Roman" w:hAnsi="Times New Roman" w:cs="Times New Roman"/>
+          <w:kern w:val="0"/>
+          <w14:ligatures w14:val="none"/>
+        </w:rPr>
+      </w:pPr>
+      <w:r>
+        <w:rPr>
+          <w:rFonts w:ascii="Times New Roman" w:eastAsia="Times New Roman" w:hAnsi="Times New Roman" w:cs="Times New Roman"/>
+          <w:kern w:val="0"/>
+          <w14:ligatures w14:val="none"/>
+        </w:rPr>
+        <w:t>Participants complete two memory measures.</w:t>
+      </w:r>
+    </w:p>
+    <w:p>
+      <w:pPr>
+        <w:spacing w:before="100" w:beforeAutospacing="1" w:after="100" w:afterAutospacing="1" w:line="360" w:lineRule="auto"/>
+        <w:rPr>
+          <w:rFonts w:ascii="Times New Roman" w:eastAsia="Times New Roman" w:hAnsi="Times New Roman" w:cs="Times New Roman"/>
+          <w:kern w:val="0"/>
+          <w14:ligatures w14:val="none"/>
+        </w:rPr>
+      </w:pPr>
+      <w:r>
+        <w:rPr>
+          <w:rFonts w:ascii="Times New Roman" w:eastAsia="Times New Roman" w:hAnsi="Times New Roman" w:cs="Times New Roman"/>
+          <w:kern w:val="0"/>
+          <w14:ligatures w14:val="none"/>
+        </w:rPr>
+        <w:t>The first is sentence recognition. A sentence is shown, and the participant determines whether it appeared in the passage.</w:t>
+      </w:r>
+    </w:p>
+    <w:p>
+      <w:pPr>
+        <w:spacing w:before="100" w:beforeAutospacing="1" w:after="100" w:afterAutospacing="1" w:line="360" w:lineRule="auto"/>
+        <w:rPr>
+          <w:rFonts w:ascii="Times New Roman" w:eastAsia="Times New Roman" w:hAnsi="Times New Roman" w:cs="Times New Roman"/>
+          <w:kern w:val="0"/>
+          <w14:ligatures w14:val="none"/>
+        </w:rPr>
+      </w:pPr>
+      <w:r>
+        <w:rPr>
+          <w:rFonts w:ascii="Times New Roman" w:eastAsia="Times New Roman" w:hAnsi="Times New Roman" w:cs="Times New Roman"/>
+          <w:kern w:val="0"/>
+          <w14:ligatures w14:val="none"/>
+        </w:rPr>
+        <w:t>The second is word-order reconstruction. Words from a target sentence are displayed in scrambled order, and the participant reconstructs the original sentence.</w:t>
+      </w:r>
+    </w:p>
+    <w:p>
+      <w:pPr>
+        <w:spacing w:before="100" w:beforeAutospacing="1" w:after="100" w:afterAutospacing="1" w:line="360" w:lineRule="auto"/>
+        <w:rPr>
+          <w:rFonts w:ascii="Times New Roman" w:eastAsia="Times New Roman" w:hAnsi="Times New Roman" w:cs="Times New Roman"/>
+          <w:kern w:val="0"/>
+          <w14:ligatures w14:val="none"/>
+        </w:rPr>
+      </w:pPr>
+      <w:r>
+        <w:rPr>
+          <w:rFonts w:ascii="Times New Roman" w:eastAsia="Times New Roman" w:hAnsi="Times New Roman" w:cs="Times New Roman"/>
+          <w:kern w:val="0"/>
+          <w14:ligatures w14:val="none"/>
+        </w:rPr>
+        <w:t>Accuracy and reaction time are recorded for both tasks.</w:t>
+      </w:r>
+    </w:p>
+    <w:p>
+      <w:pPr>
+        <w:spacing w:before="100" w:beforeAutospacing="1" w:after="100" w:afterAutospacing="1" w:line="360" w:lineRule="auto"/>
+        <w:outlineLvl w:val="2"/>
+        <w:rPr>
+          <w:rFonts w:ascii="Times New Roman" w:eastAsia="Times New Roman" w:hAnsi="Times New Roman" w:cs="Times New Roman"/>
+          <w:b/>
+          <w:bCs/>
+          <w:kern w:val="0"/>
+          <w:sz w:val="27"/>
+          <w:szCs w:val="27"/>
+          <w14:ligatures w14:val="none"/>
+        </w:rPr>
+      </w:pPr>
+      <w:r>
+        <w:rPr>
+          <w:rFonts w:ascii="Times New Roman" w:eastAsia="Times New Roman" w:hAnsi="Times New Roman" w:cs="Times New Roman"/>
+          <w:b/>
+          <w:bCs/>
+          <w:kern w:val="0"/>
+          <w:sz w:val="27"/>
+          <w:szCs w:val="27"/>
+          <w14:ligatures w14:val="none"/>
+        </w:rPr>
+        <w:t>3.6 Measures</w:t>
+      </w:r>
+    </w:p>
+    <w:tbl>
+      <w:tblPr>
+        <w:tblW w:w="0" w:type="auto"/>
+        <w:tblCellSpacing w:w="15" w:type="dxa"/>
+        <w:tblCellMar>
+          <w:top w:w="15" w:type="dxa"/>
+          <w:left w:w="15" w:type="dxa"/>
+          <w:bottom w:w="15" w:type="dxa"/>
+          <w:right w:w="15" w:type="dxa"/>
+        </w:tblCellMar>
+        <w:tblLook w:val="04A0" w:firstRow="1" w:lastRow="0" w:firstColumn="1" w:lastColumn="0" w:noHBand="0" w:noVBand="1"/>
+      </w:tblPr>
+      <w:tblGrid>
+        <w:gridCol w:w="2548"/>
+        <w:gridCol w:w="4700"/>
+      </w:tblGrid>
+      <w:tr>
+        <w:trPr>
+          <w:tblHeader/>
+          <w:tblCellSpacing w:w="15" w:type="dxa"/>
+        </w:trPr>
+        <w:tc>
+          <w:tcPr>
+            <w:tcW w:w="0" w:type="auto"/>
+            <w:vAlign w:val="center"/>
+            <w:hideMark/>
+          </w:tcPr>
+          <w:p>
+            <w:pPr>
+              <w:spacing w:after="0" w:line="360" w:lineRule="auto"/>
+              <w:jc w:val="center"/>
+              <w:rPr>
+                <w:rFonts w:ascii="Times New Roman" w:eastAsia="Times New Roman" w:hAnsi="Times New Roman" w:cs="Times New Roman"/>
+                <w:b/>
+                <w:bCs/>
+                <w:kern w:val="0"/>
+                <w14:ligatures w14:val="none"/>
+              </w:rPr>
+            </w:pPr>
+            <w:r>
+              <w:rPr>
+                <w:rFonts w:ascii="Times New Roman" w:eastAsia="Times New Roman" w:hAnsi="Times New Roman" w:cs="Times New Roman"/>
+                <w:b/>
+                <w:bCs/>
+                <w:kern w:val="0"/>
+                <w14:ligatures w14:val="none"/>
+              </w:rPr>
+              <w:t>Construct</w:t>
+            </w:r>
+          </w:p>
+        </w:tc>
+        <w:tc>
+          <w:tcPr>
+            <w:tcW w:w="0" w:type="auto"/>
+            <w:vAlign w:val="center"/>
+            <w:hideMark/>
+          </w:tcPr>
+          <w:p>
+            <w:pPr>
+              <w:spacing w:after="0" w:line="360" w:lineRule="auto"/>
+              <w:jc w:val="center"/>
+              <w:rPr>
+                <w:rFonts w:ascii="Times New Roman" w:eastAsia="Times New Roman" w:hAnsi="Times New Roman" w:cs="Times New Roman"/>
+                <w:b/>
+                <w:bCs/>
+                <w:kern w:val="0"/>
+                <w14:ligatures w14:val="none"/>
+              </w:rPr>
+            </w:pPr>
+            <w:r>
+              <w:rPr>
+                <w:rFonts w:ascii="Times New Roman" w:eastAsia="Times New Roman" w:hAnsi="Times New Roman" w:cs="Times New Roman"/>
+                <w:b/>
+                <w:bCs/>
+                <w:kern w:val="0"/>
+                <w14:ligatures w14:val="none"/>
+              </w:rPr>
+              <w:t>Operational measure</w:t>
+            </w:r>
+          </w:p>
+        </w:tc>
+      </w:tr>
+      <w:tr>
+        <w:trPr>
+          <w:tblCellSpacing w:w="15" w:type="dxa"/>
+        </w:trPr>
+        <w:tc>
+          <w:tcPr>
+            <w:tcW w:w="0" w:type="auto"/>
+            <w:vAlign w:val="center"/>
+            <w:hideMark/>
+          </w:tcPr>
+          <w:p>
+            <w:pPr>
+              <w:spacing w:after="0" w:line="360" w:lineRule="auto"/>
+              <w:rPr>
+                <w:rFonts w:ascii="Times New Roman" w:eastAsia="Times New Roman" w:hAnsi="Times New Roman" w:cs="Times New Roman"/>
+                <w:kern w:val="0"/>
+                <w14:ligatures w14:val="none"/>
+              </w:rPr>
+            </w:pPr>
+            <w:r>
+              <w:rPr>
+                <w:rFonts w:ascii="Times New Roman" w:eastAsia="Times New Roman" w:hAnsi="Times New Roman" w:cs="Times New Roman"/>
+                <w:kern w:val="0"/>
+                <w14:ligatures w14:val="none"/>
+              </w:rPr>
+              <w:t>Actual authorship</w:t>
+            </w:r>
+          </w:p>
+        </w:tc>
+        <w:tc>
+          <w:tcPr>
+            <w:tcW w:w="0" w:type="auto"/>
+            <w:vAlign w:val="center"/>
+            <w:hideMark/>
+          </w:tcPr>
+          <w:p>
+            <w:pPr>
+              <w:spacing w:after="0" w:line="360" w:lineRule="auto"/>
+              <w:rPr>
+                <w:rFonts w:ascii="Times New Roman" w:eastAsia="Times New Roman" w:hAnsi="Times New Roman" w:cs="Times New Roman"/>
+                <w:kern w:val="0"/>
+                <w14:ligatures w14:val="none"/>
+              </w:rPr>
+            </w:pPr>
+            <w:r>
+              <w:rPr>
+                <w:rFonts w:ascii="Times New Roman" w:eastAsia="Times New Roman" w:hAnsi="Times New Roman" w:cs="Times New Roman"/>
+                <w:kern w:val="0"/>
+                <w14:ligatures w14:val="none"/>
+              </w:rPr>
+              <w:t>Human, AI, or hybrid condition</w:t>
+            </w:r>
+          </w:p>
+        </w:tc>
+      </w:tr>
+      <w:tr>
+        <w:trPr>
+          <w:tblCellSpacing w:w="15" w:type="dxa"/>
+        </w:trPr>
+        <w:tc>
+          <w:tcPr>
+            <w:tcW w:w="0" w:type="auto"/>
+            <w:vAlign w:val="center"/>
+            <w:hideMark/>
+          </w:tcPr>
+          <w:p>
+            <w:pPr>
+              <w:spacing w:after="0" w:line="360" w:lineRule="auto"/>
+              <w:rPr>
+                <w:rFonts w:ascii="Times New Roman" w:eastAsia="Times New Roman" w:hAnsi="Times New Roman" w:cs="Times New Roman"/>
+                <w:kern w:val="0"/>
+                <w14:ligatures w14:val="none"/>
+              </w:rPr>
+            </w:pPr>
+            <w:r>
+              <w:rPr>
+                <w:rFonts w:ascii="Times New Roman" w:eastAsia="Times New Roman" w:hAnsi="Times New Roman" w:cs="Times New Roman"/>
+                <w:kern w:val="0"/>
+                <w14:ligatures w14:val="none"/>
+              </w:rPr>
+              <w:t>Perceived authorship</w:t>
+            </w:r>
+          </w:p>
+        </w:tc>
+        <w:tc>
+          <w:tcPr>
+            <w:tcW w:w="0" w:type="auto"/>
+            <w:vAlign w:val="center"/>
+            <w:hideMark/>
+          </w:tcPr>
+          <w:p>
+            <w:pPr>
+              <w:spacing w:after="0" w:line="360" w:lineRule="auto"/>
+              <w:rPr>
+                <w:rFonts w:ascii="Times New Roman" w:eastAsia="Times New Roman" w:hAnsi="Times New Roman" w:cs="Times New Roman"/>
+                <w:kern w:val="0"/>
+                <w14:ligatures w14:val="none"/>
+              </w:rPr>
+            </w:pPr>
+            <w:r>
+              <w:rPr>
+                <w:rFonts w:ascii="Times New Roman" w:eastAsia="Times New Roman" w:hAnsi="Times New Roman" w:cs="Times New Roman"/>
+                <w:kern w:val="0"/>
+                <w14:ligatures w14:val="none"/>
+              </w:rPr>
+              <w:t>Four-category classification</w:t>
+            </w:r>
+          </w:p>
+        </w:tc>
+      </w:tr>
+      <w:tr>
+        <w:trPr>
+          <w:tblCellSpacing w:w="15" w:type="dxa"/>
+        </w:trPr>
+        <w:tc>
+          <w:tcPr>
+            <w:tcW w:w="0" w:type="auto"/>
+            <w:vAlign w:val="center"/>
+            <w:hideMark/>
+          </w:tcPr>
+          <w:p>
+            <w:pPr>
+              <w:spacing w:after="0" w:line="360" w:lineRule="auto"/>
+              <w:rPr>
+                <w:rFonts w:ascii="Times New Roman" w:eastAsia="Times New Roman" w:hAnsi="Times New Roman" w:cs="Times New Roman"/>
+                <w:kern w:val="0"/>
+                <w14:ligatures w14:val="none"/>
+              </w:rPr>
+            </w:pPr>
+            <w:r>
+              <w:rPr>
+                <w:rFonts w:ascii="Times New Roman" w:eastAsia="Times New Roman" w:hAnsi="Times New Roman" w:cs="Times New Roman"/>
+                <w:kern w:val="0"/>
+                <w14:ligatures w14:val="none"/>
+              </w:rPr>
+              <w:lastRenderedPageBreak/>
+              <w:t>Perceived AI authorship</w:t>
+            </w:r>
+          </w:p>
+        </w:tc>
+        <w:tc>
+          <w:tcPr>
+            <w:tcW w:w="0" w:type="auto"/>
+            <w:vAlign w:val="center"/>
+            <w:hideMark/>
+          </w:tcPr>
+          <w:p>
+            <w:pPr>
+              <w:spacing w:after="0" w:line="360" w:lineRule="auto"/>
+              <w:rPr>
+                <w:rFonts w:ascii="Times New Roman" w:eastAsia="Times New Roman" w:hAnsi="Times New Roman" w:cs="Times New Roman"/>
+                <w:kern w:val="0"/>
+                <w14:ligatures w14:val="none"/>
+              </w:rPr>
+            </w:pPr>
+            <w:r>
+              <w:rPr>
+                <w:rFonts w:ascii="Times New Roman" w:eastAsia="Times New Roman" w:hAnsi="Times New Roman" w:cs="Times New Roman"/>
+                <w:kern w:val="0"/>
+                <w14:ligatures w14:val="none"/>
+              </w:rPr>
+              <w:t>AI-likelihood rating</w:t>
+            </w:r>
+          </w:p>
+        </w:tc>
+      </w:tr>
+      <w:tr>
+        <w:trPr>
+          <w:tblCellSpacing w:w="15" w:type="dxa"/>
+        </w:trPr>
+        <w:tc>
+          <w:tcPr>
+            <w:tcW w:w="0" w:type="auto"/>
+            <w:vAlign w:val="center"/>
+            <w:hideMark/>
+          </w:tcPr>
+          <w:p>
+            <w:pPr>
+              <w:spacing w:after="0" w:line="360" w:lineRule="auto"/>
+              <w:rPr>
+                <w:rFonts w:ascii="Times New Roman" w:eastAsia="Times New Roman" w:hAnsi="Times New Roman" w:cs="Times New Roman"/>
+                <w:kern w:val="0"/>
+                <w14:ligatures w14:val="none"/>
+              </w:rPr>
+            </w:pPr>
+            <w:r>
+              <w:rPr>
+                <w:rFonts w:ascii="Times New Roman" w:eastAsia="Times New Roman" w:hAnsi="Times New Roman" w:cs="Times New Roman"/>
+                <w:kern w:val="0"/>
+                <w14:ligatures w14:val="none"/>
+              </w:rPr>
+              <w:t>Fluency</w:t>
+            </w:r>
+          </w:p>
+        </w:tc>
+        <w:tc>
+          <w:tcPr>
+            <w:tcW w:w="0" w:type="auto"/>
+            <w:vAlign w:val="center"/>
+            <w:hideMark/>
+          </w:tcPr>
+          <w:p>
+            <w:pPr>
+              <w:spacing w:after="0" w:line="360" w:lineRule="auto"/>
+              <w:rPr>
+                <w:rFonts w:ascii="Times New Roman" w:eastAsia="Times New Roman" w:hAnsi="Times New Roman" w:cs="Times New Roman"/>
+                <w:kern w:val="0"/>
+                <w14:ligatures w14:val="none"/>
+              </w:rPr>
+            </w:pPr>
+            <w:r>
+              <w:rPr>
+                <w:rFonts w:ascii="Times New Roman" w:eastAsia="Times New Roman" w:hAnsi="Times New Roman" w:cs="Times New Roman"/>
+                <w:kern w:val="0"/>
+                <w14:ligatures w14:val="none"/>
+              </w:rPr>
+              <w:t>Five-point Likert rating</w:t>
+            </w:r>
+          </w:p>
+        </w:tc>
+      </w:tr>
+      <w:tr>
+        <w:trPr>
+          <w:tblCellSpacing w:w="15" w:type="dxa"/>
+        </w:trPr>
+        <w:tc>
+          <w:tcPr>
+            <w:tcW w:w="0" w:type="auto"/>
+            <w:vAlign w:val="center"/>
+            <w:hideMark/>
+          </w:tcPr>
+          <w:p>
+            <w:pPr>
+              <w:spacing w:after="0" w:line="360" w:lineRule="auto"/>
+              <w:rPr>
+                <w:rFonts w:ascii="Times New Roman" w:eastAsia="Times New Roman" w:hAnsi="Times New Roman" w:cs="Times New Roman"/>
+                <w:kern w:val="0"/>
+                <w14:ligatures w14:val="none"/>
+              </w:rPr>
+            </w:pPr>
+            <w:r>
+              <w:rPr>
+                <w:rFonts w:ascii="Times New Roman" w:eastAsia="Times New Roman" w:hAnsi="Times New Roman" w:cs="Times New Roman"/>
+                <w:kern w:val="0"/>
+                <w14:ligatures w14:val="none"/>
+              </w:rPr>
+              <w:t>Structural regularity</w:t>
+            </w:r>
+          </w:p>
+        </w:tc>
+        <w:tc>
+          <w:tcPr>
+            <w:tcW w:w="0" w:type="auto"/>
+            <w:vAlign w:val="center"/>
+            <w:hideMark/>
+          </w:tcPr>
+          <w:p>
+            <w:pPr>
+              <w:spacing w:after="0" w:line="360" w:lineRule="auto"/>
+              <w:rPr>
+                <w:rFonts w:ascii="Times New Roman" w:eastAsia="Times New Roman" w:hAnsi="Times New Roman" w:cs="Times New Roman"/>
+                <w:kern w:val="0"/>
+                <w14:ligatures w14:val="none"/>
+              </w:rPr>
+            </w:pPr>
+            <w:r>
+              <w:rPr>
+                <w:rFonts w:ascii="Times New Roman" w:eastAsia="Times New Roman" w:hAnsi="Times New Roman" w:cs="Times New Roman"/>
+                <w:kern w:val="0"/>
+                <w14:ligatures w14:val="none"/>
+              </w:rPr>
+              <w:t>Five-point Likert rating</w:t>
+            </w:r>
+          </w:p>
+        </w:tc>
+      </w:tr>
+      <w:tr>
+        <w:trPr>
+          <w:tblCellSpacing w:w="15" w:type="dxa"/>
+        </w:trPr>
+        <w:tc>
+          <w:tcPr>
+            <w:tcW w:w="0" w:type="auto"/>
+            <w:vAlign w:val="center"/>
+            <w:hideMark/>
+          </w:tcPr>
+          <w:p>
+            <w:pPr>
+              <w:spacing w:after="0" w:line="360" w:lineRule="auto"/>
+              <w:rPr>
+                <w:rFonts w:ascii="Times New Roman" w:eastAsia="Times New Roman" w:hAnsi="Times New Roman" w:cs="Times New Roman"/>
+                <w:kern w:val="0"/>
+                <w14:ligatures w14:val="none"/>
+              </w:rPr>
+            </w:pPr>
+            <w:r>
+              <w:rPr>
+                <w:rFonts w:ascii="Times New Roman" w:eastAsia="Times New Roman" w:hAnsi="Times New Roman" w:cs="Times New Roman"/>
+                <w:kern w:val="0"/>
+                <w14:ligatures w14:val="none"/>
+              </w:rPr>
+              <w:t>Clarity</w:t>
+            </w:r>
+          </w:p>
+        </w:tc>
+        <w:tc>
+          <w:tcPr>
+            <w:tcW w:w="0" w:type="auto"/>
+            <w:vAlign w:val="center"/>
+            <w:hideMark/>
+          </w:tcPr>
+          <w:p>
+            <w:pPr>
+              <w:spacing w:after="0" w:line="360" w:lineRule="auto"/>
+              <w:rPr>
+                <w:rFonts w:ascii="Times New Roman" w:eastAsia="Times New Roman" w:hAnsi="Times New Roman" w:cs="Times New Roman"/>
+                <w:kern w:val="0"/>
+                <w14:ligatures w14:val="none"/>
+              </w:rPr>
+            </w:pPr>
+            <w:r>
+              <w:rPr>
+                <w:rFonts w:ascii="Times New Roman" w:eastAsia="Times New Roman" w:hAnsi="Times New Roman" w:cs="Times New Roman"/>
+                <w:kern w:val="0"/>
+                <w14:ligatures w14:val="none"/>
+              </w:rPr>
+              <w:t>Five-point Likert rating</w:t>
+            </w:r>
+          </w:p>
+        </w:tc>
+      </w:tr>
+      <w:tr>
+        <w:trPr>
+          <w:tblCellSpacing w:w="15" w:type="dxa"/>
+        </w:trPr>
+        <w:tc>
+          <w:tcPr>
+            <w:tcW w:w="0" w:type="auto"/>
+            <w:vAlign w:val="center"/>
+            <w:hideMark/>
+          </w:tcPr>
+          <w:p>
+            <w:pPr>
+              <w:spacing w:after="0" w:line="360" w:lineRule="auto"/>
+              <w:rPr>
+                <w:rFonts w:ascii="Times New Roman" w:eastAsia="Times New Roman" w:hAnsi="Times New Roman" w:cs="Times New Roman"/>
+                <w:kern w:val="0"/>
+                <w14:ligatures w14:val="none"/>
+              </w:rPr>
+            </w:pPr>
+            <w:r>
+              <w:rPr>
+                <w:rFonts w:ascii="Times New Roman" w:eastAsia="Times New Roman" w:hAnsi="Times New Roman" w:cs="Times New Roman"/>
+                <w:kern w:val="0"/>
+                <w14:ligatures w14:val="none"/>
+              </w:rPr>
+              <w:t>Emotional expression</w:t>
+            </w:r>
+          </w:p>
+        </w:tc>
+        <w:tc>
+          <w:tcPr>
+            <w:tcW w:w="0" w:type="auto"/>
+            <w:vAlign w:val="center"/>
+            <w:hideMark/>
+          </w:tcPr>
+          <w:p>
+            <w:pPr>
+              <w:spacing w:after="0" w:line="360" w:lineRule="auto"/>
+              <w:rPr>
+                <w:rFonts w:ascii="Times New Roman" w:eastAsia="Times New Roman" w:hAnsi="Times New Roman" w:cs="Times New Roman"/>
+                <w:kern w:val="0"/>
+                <w14:ligatures w14:val="none"/>
+              </w:rPr>
+            </w:pPr>
+            <w:r>
+              <w:rPr>
+                <w:rFonts w:ascii="Times New Roman" w:eastAsia="Times New Roman" w:hAnsi="Times New Roman" w:cs="Times New Roman"/>
+                <w:kern w:val="0"/>
+                <w14:ligatures w14:val="none"/>
+              </w:rPr>
+              <w:t>Five-point Likert rating</w:t>
+            </w:r>
+          </w:p>
+        </w:tc>
+      </w:tr>
+      <w:tr>
+        <w:trPr>
+          <w:tblCellSpacing w:w="15" w:type="dxa"/>
+        </w:trPr>
+        <w:tc>
+          <w:tcPr>
+            <w:tcW w:w="0" w:type="auto"/>
+            <w:vAlign w:val="center"/>
+            <w:hideMark/>
+          </w:tcPr>
+          <w:p>
+            <w:pPr>
+              <w:spacing w:after="0" w:line="360" w:lineRule="auto"/>
+              <w:rPr>
+                <w:rFonts w:ascii="Times New Roman" w:eastAsia="Times New Roman" w:hAnsi="Times New Roman" w:cs="Times New Roman"/>
+                <w:kern w:val="0"/>
+                <w14:ligatures w14:val="none"/>
+              </w:rPr>
+            </w:pPr>
+            <w:r>
+              <w:rPr>
+                <w:rFonts w:ascii="Times New Roman" w:eastAsia="Times New Roman" w:hAnsi="Times New Roman" w:cs="Times New Roman"/>
+                <w:kern w:val="0"/>
+                <w14:ligatures w14:val="none"/>
+              </w:rPr>
+              <w:t>Personal voice</w:t>
+            </w:r>
+          </w:p>
+        </w:tc>
+        <w:tc>
+          <w:tcPr>
+            <w:tcW w:w="0" w:type="auto"/>
+            <w:vAlign w:val="center"/>
+            <w:hideMark/>
+          </w:tcPr>
+          <w:p>
+            <w:pPr>
+              <w:spacing w:after="0" w:line="360" w:lineRule="auto"/>
+              <w:rPr>
+                <w:rFonts w:ascii="Times New Roman" w:eastAsia="Times New Roman" w:hAnsi="Times New Roman" w:cs="Times New Roman"/>
+                <w:kern w:val="0"/>
+                <w14:ligatures w14:val="none"/>
+              </w:rPr>
+            </w:pPr>
+            <w:r>
+              <w:rPr>
+                <w:rFonts w:ascii="Times New Roman" w:eastAsia="Times New Roman" w:hAnsi="Times New Roman" w:cs="Times New Roman"/>
+                <w:kern w:val="0"/>
+                <w14:ligatures w14:val="none"/>
+              </w:rPr>
+              <w:t>Five-point Likert rating</w:t>
+            </w:r>
+          </w:p>
+        </w:tc>
+      </w:tr>
+      <w:tr>
+        <w:trPr>
+          <w:tblCellSpacing w:w="15" w:type="dxa"/>
+        </w:trPr>
+        <w:tc>
+          <w:tcPr>
+            <w:tcW w:w="0" w:type="auto"/>
+            <w:vAlign w:val="center"/>
+            <w:hideMark/>
+          </w:tcPr>
+          <w:p>
+            <w:pPr>
+              <w:spacing w:after="0" w:line="360" w:lineRule="auto"/>
+              <w:rPr>
+                <w:rFonts w:ascii="Times New Roman" w:eastAsia="Times New Roman" w:hAnsi="Times New Roman" w:cs="Times New Roman"/>
+                <w:kern w:val="0"/>
+                <w14:ligatures w14:val="none"/>
+              </w:rPr>
+            </w:pPr>
+            <w:r>
+              <w:rPr>
+                <w:rFonts w:ascii="Times New Roman" w:eastAsia="Times New Roman" w:hAnsi="Times New Roman" w:cs="Times New Roman"/>
+                <w:kern w:val="0"/>
+                <w14:ligatures w14:val="none"/>
+              </w:rPr>
+              <w:t>Genericness</w:t>
+            </w:r>
+          </w:p>
+        </w:tc>
+        <w:tc>
+          <w:tcPr>
+            <w:tcW w:w="0" w:type="auto"/>
+            <w:vAlign w:val="center"/>
+            <w:hideMark/>
+          </w:tcPr>
+          <w:p>
+            <w:pPr>
+              <w:spacing w:after="0" w:line="360" w:lineRule="auto"/>
+              <w:rPr>
+                <w:rFonts w:ascii="Times New Roman" w:eastAsia="Times New Roman" w:hAnsi="Times New Roman" w:cs="Times New Roman"/>
+                <w:kern w:val="0"/>
+                <w14:ligatures w14:val="none"/>
+              </w:rPr>
+            </w:pPr>
+            <w:r>
+              <w:rPr>
+                <w:rFonts w:ascii="Times New Roman" w:eastAsia="Times New Roman" w:hAnsi="Times New Roman" w:cs="Times New Roman"/>
+                <w:kern w:val="0"/>
+                <w14:ligatures w14:val="none"/>
+              </w:rPr>
+              <w:t>Five-point Likert rating</w:t>
+            </w:r>
+          </w:p>
+        </w:tc>
+      </w:tr>
+      <w:tr>
+        <w:trPr>
+          <w:tblCellSpacing w:w="15" w:type="dxa"/>
+        </w:trPr>
+        <w:tc>
+          <w:tcPr>
+            <w:tcW w:w="0" w:type="auto"/>
+            <w:vAlign w:val="center"/>
+            <w:hideMark/>
+          </w:tcPr>
+          <w:p>
+            <w:pPr>
+              <w:spacing w:after="0" w:line="360" w:lineRule="auto"/>
+              <w:rPr>
+                <w:rFonts w:ascii="Times New Roman" w:eastAsia="Times New Roman" w:hAnsi="Times New Roman" w:cs="Times New Roman"/>
+                <w:kern w:val="0"/>
+                <w14:ligatures w14:val="none"/>
+              </w:rPr>
+            </w:pPr>
+            <w:r>
+              <w:rPr>
+                <w:rFonts w:ascii="Times New Roman" w:eastAsia="Times New Roman" w:hAnsi="Times New Roman" w:cs="Times New Roman"/>
+                <w:kern w:val="0"/>
+                <w14:ligatures w14:val="none"/>
+              </w:rPr>
+              <w:t>Naturalness</w:t>
+            </w:r>
+          </w:p>
+        </w:tc>
+        <w:tc>
+          <w:tcPr>
+            <w:tcW w:w="0" w:type="auto"/>
+            <w:vAlign w:val="center"/>
+            <w:hideMark/>
+          </w:tcPr>
+          <w:p>
+            <w:pPr>
+              <w:spacing w:after="0" w:line="360" w:lineRule="auto"/>
+              <w:rPr>
+                <w:rFonts w:ascii="Times New Roman" w:eastAsia="Times New Roman" w:hAnsi="Times New Roman" w:cs="Times New Roman"/>
+                <w:kern w:val="0"/>
+                <w14:ligatures w14:val="none"/>
+              </w:rPr>
+            </w:pPr>
+            <w:r>
+              <w:rPr>
+                <w:rFonts w:ascii="Times New Roman" w:eastAsia="Times New Roman" w:hAnsi="Times New Roman" w:cs="Times New Roman"/>
+                <w:kern w:val="0"/>
+                <w14:ligatures w14:val="none"/>
+              </w:rPr>
+              <w:t>Five-point Likert rating</w:t>
+            </w:r>
+          </w:p>
+        </w:tc>
+      </w:tr>
+      <w:tr>
+        <w:trPr>
+          <w:tblCellSpacing w:w="15" w:type="dxa"/>
+        </w:trPr>
+        <w:tc>
+          <w:tcPr>
+            <w:tcW w:w="0" w:type="auto"/>
+            <w:vAlign w:val="center"/>
+            <w:hideMark/>
+          </w:tcPr>
+          <w:p>
+            <w:pPr>
+              <w:spacing w:after="0" w:line="360" w:lineRule="auto"/>
+              <w:rPr>
+                <w:rFonts w:ascii="Times New Roman" w:eastAsia="Times New Roman" w:hAnsi="Times New Roman" w:cs="Times New Roman"/>
+                <w:kern w:val="0"/>
+                <w14:ligatures w14:val="none"/>
+              </w:rPr>
+            </w:pPr>
+            <w:r>
+              <w:rPr>
+                <w:rFonts w:ascii="Times New Roman" w:eastAsia="Times New Roman" w:hAnsi="Times New Roman" w:cs="Times New Roman"/>
+                <w:kern w:val="0"/>
+                <w14:ligatures w14:val="none"/>
+              </w:rPr>
+              <w:t>Reading processing</w:t>
+            </w:r>
+          </w:p>
+        </w:tc>
+        <w:tc>
+          <w:tcPr>
+            <w:tcW w:w="0" w:type="auto"/>
+            <w:vAlign w:val="center"/>
+            <w:hideMark/>
+          </w:tcPr>
+          <w:p>
+            <w:pPr>
+              <w:spacing w:after="0" w:line="360" w:lineRule="auto"/>
+              <w:rPr>
+                <w:rFonts w:ascii="Times New Roman" w:eastAsia="Times New Roman" w:hAnsi="Times New Roman" w:cs="Times New Roman"/>
+                <w:kern w:val="0"/>
+                <w14:ligatures w14:val="none"/>
+              </w:rPr>
+            </w:pPr>
+            <w:r>
+              <w:rPr>
+                <w:rFonts w:ascii="Times New Roman" w:eastAsia="Times New Roman" w:hAnsi="Times New Roman" w:cs="Times New Roman"/>
+                <w:kern w:val="0"/>
+                <w14:ligatures w14:val="none"/>
+              </w:rPr>
+              <w:t>Reading time</w:t>
+            </w:r>
+          </w:p>
+        </w:tc>
+      </w:tr>
+      <w:tr>
+        <w:trPr>
+          <w:tblCellSpacing w:w="15" w:type="dxa"/>
+        </w:trPr>
+        <w:tc>
+          <w:tcPr>
+            <w:tcW w:w="0" w:type="auto"/>
+            <w:vAlign w:val="center"/>
+            <w:hideMark/>
+          </w:tcPr>
+          <w:p>
+            <w:pPr>
+              <w:spacing w:after="0" w:line="360" w:lineRule="auto"/>
+              <w:rPr>
+                <w:rFonts w:ascii="Times New Roman" w:eastAsia="Times New Roman" w:hAnsi="Times New Roman" w:cs="Times New Roman"/>
+                <w:kern w:val="0"/>
+                <w14:ligatures w14:val="none"/>
+              </w:rPr>
+            </w:pPr>
+            <w:r>
+              <w:rPr>
+                <w:rFonts w:ascii="Times New Roman" w:eastAsia="Times New Roman" w:hAnsi="Times New Roman" w:cs="Times New Roman"/>
+                <w:kern w:val="0"/>
+                <w14:ligatures w14:val="none"/>
+              </w:rPr>
+              <w:t>Text memory</w:t>
+            </w:r>
+          </w:p>
+        </w:tc>
+        <w:tc>
+          <w:tcPr>
+            <w:tcW w:w="0" w:type="auto"/>
+            <w:vAlign w:val="center"/>
+            <w:hideMark/>
+          </w:tcPr>
+          <w:p>
+            <w:pPr>
+              <w:spacing w:after="0" w:line="360" w:lineRule="auto"/>
+              <w:rPr>
+                <w:rFonts w:ascii="Times New Roman" w:eastAsia="Times New Roman" w:hAnsi="Times New Roman" w:cs="Times New Roman"/>
+                <w:kern w:val="0"/>
+                <w14:ligatures w14:val="none"/>
+              </w:rPr>
+            </w:pPr>
+            <w:r>
+              <w:rPr>
+                <w:rFonts w:ascii="Times New Roman" w:eastAsia="Times New Roman" w:hAnsi="Times New Roman" w:cs="Times New Roman"/>
+                <w:kern w:val="0"/>
+                <w14:ligatures w14:val="none"/>
+              </w:rPr>
+              <w:t>Sentence-recognition accuracy</w:t>
+            </w:r>
+          </w:p>
+        </w:tc>
+      </w:tr>
+      <w:tr>
+        <w:trPr>
+          <w:tblCellSpacing w:w="15" w:type="dxa"/>
+        </w:trPr>
+        <w:tc>
+          <w:tcPr>
+            <w:tcW w:w="0" w:type="auto"/>
+            <w:vAlign w:val="center"/>
+            <w:hideMark/>
+          </w:tcPr>
+          <w:p>
+            <w:pPr>
+              <w:spacing w:after="0" w:line="360" w:lineRule="auto"/>
+              <w:rPr>
+                <w:rFonts w:ascii="Times New Roman" w:eastAsia="Times New Roman" w:hAnsi="Times New Roman" w:cs="Times New Roman"/>
+                <w:kern w:val="0"/>
+                <w14:ligatures w14:val="none"/>
+              </w:rPr>
+            </w:pPr>
+            <w:r>
+              <w:rPr>
+                <w:rFonts w:ascii="Times New Roman" w:eastAsia="Times New Roman" w:hAnsi="Times New Roman" w:cs="Times New Roman"/>
+                <w:kern w:val="0"/>
+                <w14:ligatures w14:val="none"/>
+              </w:rPr>
+              <w:t>Syntactic reconstruction</w:t>
+            </w:r>
+          </w:p>
+        </w:tc>
+        <w:tc>
+          <w:tcPr>
+            <w:tcW w:w="0" w:type="auto"/>
+            <w:vAlign w:val="center"/>
+            <w:hideMark/>
+          </w:tcPr>
+          <w:p>
+            <w:pPr>
+              <w:spacing w:after="0" w:line="360" w:lineRule="auto"/>
+              <w:rPr>
+                <w:rFonts w:ascii="Times New Roman" w:eastAsia="Times New Roman" w:hAnsi="Times New Roman" w:cs="Times New Roman"/>
+                <w:kern w:val="0"/>
+                <w14:ligatures w14:val="none"/>
+              </w:rPr>
+            </w:pPr>
+            <w:r>
+              <w:rPr>
+                <w:rFonts w:ascii="Times New Roman" w:eastAsia="Times New Roman" w:hAnsi="Times New Roman" w:cs="Times New Roman"/>
+                <w:kern w:val="0"/>
+                <w14:ligatures w14:val="none"/>
+              </w:rPr>
+              <w:t>Word-order reconstruction accuracy</w:t>
+            </w:r>
+          </w:p>
+        </w:tc>
+      </w:tr>
+      <w:tr>
+        <w:trPr>
+          <w:tblCellSpacing w:w="15" w:type="dxa"/>
+        </w:trPr>
+        <w:tc>
+          <w:tcPr>
+            <w:tcW w:w="0" w:type="auto"/>
+            <w:vAlign w:val="center"/>
+            <w:hideMark/>
+          </w:tcPr>
+          <w:p>
+            <w:pPr>
+              <w:spacing w:after="0" w:line="360" w:lineRule="auto"/>
+              <w:rPr>
+                <w:rFonts w:ascii="Times New Roman" w:eastAsia="Times New Roman" w:hAnsi="Times New Roman" w:cs="Times New Roman"/>
+                <w:kern w:val="0"/>
+                <w14:ligatures w14:val="none"/>
+              </w:rPr>
+            </w:pPr>
+            <w:r>
+              <w:rPr>
+                <w:rFonts w:ascii="Times New Roman" w:eastAsia="Times New Roman" w:hAnsi="Times New Roman" w:cs="Times New Roman"/>
+                <w:kern w:val="0"/>
+                <w14:ligatures w14:val="none"/>
+              </w:rPr>
+              <w:t>Decision processing</w:t>
+            </w:r>
+          </w:p>
+        </w:tc>
+        <w:tc>
+          <w:tcPr>
+            <w:tcW w:w="0" w:type="auto"/>
+            <w:vAlign w:val="center"/>
+            <w:hideMark/>
+          </w:tcPr>
+          <w:p>
+            <w:pPr>
+              <w:spacing w:after="0" w:line="360" w:lineRule="auto"/>
+              <w:rPr>
+                <w:rFonts w:ascii="Times New Roman" w:eastAsia="Times New Roman" w:hAnsi="Times New Roman" w:cs="Times New Roman"/>
+                <w:kern w:val="0"/>
+                <w14:ligatures w14:val="none"/>
+              </w:rPr>
+            </w:pPr>
+            <w:r>
+              <w:rPr>
+                <w:rFonts w:ascii="Times New Roman" w:eastAsia="Times New Roman" w:hAnsi="Times New Roman" w:cs="Times New Roman"/>
+                <w:kern w:val="0"/>
+                <w14:ligatures w14:val="none"/>
+              </w:rPr>
+              <w:t>Reaction time</w:t>
+            </w:r>
+          </w:p>
+        </w:tc>
+      </w:tr>
+      <w:tr>
+        <w:trPr>
+          <w:tblCellSpacing w:w="15" w:type="dxa"/>
+        </w:trPr>
+        <w:tc>
+          <w:tcPr>
+            <w:tcW w:w="0" w:type="auto"/>
+            <w:vAlign w:val="center"/>
+            <w:hideMark/>
+          </w:tcPr>
+          <w:p>
+            <w:pPr>
+              <w:spacing w:after="0" w:line="360" w:lineRule="auto"/>
+              <w:rPr>
+                <w:rFonts w:ascii="Times New Roman" w:eastAsia="Times New Roman" w:hAnsi="Times New Roman" w:cs="Times New Roman"/>
+                <w:kern w:val="0"/>
+                <w14:ligatures w14:val="none"/>
+              </w:rPr>
+            </w:pPr>
+            <w:r>
+              <w:rPr>
+                <w:rFonts w:ascii="Times New Roman" w:eastAsia="Times New Roman" w:hAnsi="Times New Roman" w:cs="Times New Roman"/>
+                <w:kern w:val="0"/>
+                <w14:ligatures w14:val="none"/>
+              </w:rPr>
+              <w:t>Participant characteristics</w:t>
+            </w:r>
+          </w:p>
+        </w:tc>
+        <w:tc>
+          <w:tcPr>
+            <w:tcW w:w="0" w:type="auto"/>
+            <w:vAlign w:val="center"/>
+            <w:hideMark/>
+          </w:tcPr>
+          <w:p>
+            <w:pPr>
+              <w:spacing w:after="0" w:line="360" w:lineRule="auto"/>
+              <w:rPr>
+                <w:rFonts w:ascii="Times New Roman" w:eastAsia="Times New Roman" w:hAnsi="Times New Roman" w:cs="Times New Roman"/>
+                <w:kern w:val="0"/>
+                <w14:ligatures w14:val="none"/>
+              </w:rPr>
+            </w:pPr>
+            <w:r>
+              <w:rPr>
+                <w:rFonts w:ascii="Times New Roman" w:eastAsia="Times New Roman" w:hAnsi="Times New Roman" w:cs="Times New Roman"/>
+                <w:kern w:val="0"/>
+                <w14:ligatures w14:val="none"/>
+              </w:rPr>
+              <w:t>Proficiency, reading, and AI-exposure measures</w:t>
+            </w:r>
+          </w:p>
+        </w:tc>
+      </w:tr>
+    </w:tbl>
+    <w:p>
+      <w:pPr>
+        <w:spacing w:before="100" w:beforeAutospacing="1" w:after="100" w:afterAutospacing="1" w:line="360" w:lineRule="auto"/>
+        <w:outlineLvl w:val="2"/>
+        <w:rPr>
+          <w:rFonts w:ascii="Times New Roman" w:eastAsia="Times New Roman" w:hAnsi="Times New Roman" w:cs="Times New Roman"/>
+          <w:b/>
+          <w:bCs/>
+          <w:kern w:val="0"/>
+          <w:sz w:val="27"/>
+          <w:szCs w:val="27"/>
+          <w14:ligatures w14:val="none"/>
+        </w:rPr>
+      </w:pPr>
+      <w:r>
+        <w:rPr>
+          <w:rFonts w:ascii="Times New Roman" w:eastAsia="Times New Roman" w:hAnsi="Times New Roman" w:cs="Times New Roman"/>
+          <w:b/>
+          <w:bCs/>
+          <w:kern w:val="0"/>
+          <w:sz w:val="27"/>
+          <w:szCs w:val="27"/>
+          <w14:ligatures w14:val="none"/>
+        </w:rPr>
+        <w:t>3.7 Data Recording and Ethical Considerations</w:t>
+      </w:r>
+    </w:p>
+    <w:p>
+      <w:pPr>
+        <w:spacing w:before="100" w:beforeAutospacing="1" w:after="100" w:afterAutospacing="1" w:line="360" w:lineRule="auto"/>
+        <w:rPr>
+          <w:rFonts w:ascii="Times New Roman" w:eastAsia="Times New Roman" w:hAnsi="Times New Roman" w:cs="Times New Roman"/>
+          <w:kern w:val="0"/>
+          <w14:ligatures w14:val="none"/>
+        </w:rPr>
+      </w:pPr>
+      <w:r>
+        <w:rPr>
+          <w:rFonts w:ascii="Times New Roman" w:eastAsia="Times New Roman" w:hAnsi="Times New Roman" w:cs="Times New Roman"/>
+          <w:kern w:val="0"/>
+          <w14:ligatures w14:val="none"/>
+        </w:rPr>
+        <w:t>The participant interface does not display source labels, model instructions, administrator settings, or API information. Formal experimental responses are stored separately from demonstration data.</w:t>
+      </w:r>
+    </w:p>
+    <w:p>
+      <w:pPr>
+        <w:spacing w:before="100" w:beforeAutospacing="1" w:after="100" w:afterAutospacing="1" w:line="360" w:lineRule="auto"/>
+        <w:rPr>
+          <w:rFonts w:ascii="Times New Roman" w:eastAsia="Times New Roman" w:hAnsi="Times New Roman" w:cs="Times New Roman"/>
+          <w:kern w:val="0"/>
+          <w14:ligatures w14:val="none"/>
+        </w:rPr>
+      </w:pPr>
+      <w:r>
+        <w:rPr>
+          <w:rFonts w:ascii="Times New Roman" w:eastAsia="Times New Roman" w:hAnsi="Times New Roman" w:cs="Times New Roman"/>
+          <w:kern w:val="0"/>
+          <w14:ligatures w14:val="none"/>
+        </w:rPr>
+        <w:t>The platform records participant-level and trial-level information in an analysis-ready dataset. Data fields include text condition, text ID, topic, reading time, authorship judgment, AI-likelihood score, cue ratings, distractor-task performance, recognition accuracy, reconstruction accuracy, and reaction time.</w:t>
+      </w:r>
+    </w:p>
+    <w:p>
+      <w:pPr>
+        <w:spacing w:before="100" w:beforeAutospacing="1" w:after="100" w:afterAutospacing="1" w:line="360" w:lineRule="auto"/>
+        <w:rPr>
+          <w:rFonts w:ascii="Times New Roman" w:eastAsia="Times New Roman" w:hAnsi="Times New Roman" w:cs="Times New Roman"/>
+          <w:kern w:val="0"/>
+          <w14:ligatures w14:val="none"/>
+        </w:rPr>
+      </w:pPr>
+      <w:r>
+        <w:rPr>
+          <w:rFonts w:ascii="Times New Roman" w:eastAsia="Times New Roman" w:hAnsi="Times New Roman" w:cs="Times New Roman"/>
+          <w:kern w:val="0"/>
+          <w14:ligatures w14:val="none"/>
+        </w:rPr>
+        <w:t>Participation is anonymous and voluntary. Participants should receive a brief explanation of the study and its data use before beginning. Because the research involves students, formal implementation should follow the applicable school requirements concerning consent, privacy, and research supervision.</w:t>
+      </w:r>
+    </w:p>
+    <w:p>
+      <w:pPr>
+        <w:spacing w:before="100" w:beforeAutospacing="1" w:after="100" w:afterAutospacing="1" w:line="360" w:lineRule="auto"/>
+        <w:rPr>
+          <w:rFonts w:ascii="Times New Roman" w:eastAsia="Times New Roman" w:hAnsi="Times New Roman" w:cs="Times New Roman"/>
+          <w:kern w:val="0"/>
+          <w14:ligatures w14:val="none"/>
+        </w:rPr>
+      </w:pPr>
     </w:p>
     <w:p>
       <w:pPr>
@@ -1544,6 +4811,602 @@
 <file path=word/numbering.xml><?xml version="1.0" encoding="utf-8"?>
 <w:numbering xmlns:wpc="http://schemas.microsoft.com/office/word/2010/wordprocessingCanvas" xmlns:cx="http://schemas.microsoft.com/office/drawing/2014/chartex" xmlns:cx1="http://schemas.microsoft.com/office/drawing/2015/9/8/chartex" xmlns:cx2="http://schemas.microsoft.com/office/drawing/2015/10/21/chartex" xmlns:cx3="http://schemas.microsoft.com/office/drawing/2016/5/9/chartex" xmlns:cx4="http://schemas.microsoft.com/office/drawing/2016/5/10/chartex" xmlns:cx5="http://schemas.microsoft.com/office/drawing/2016/5/11/chartex" xmlns:cx6="http://schemas.microsoft.com/office/drawing/2016/5/12/chartex" xmlns:cx7="http://schemas.microsoft.com/office/drawing/2016/5/13/chartex" xmlns:cx8="http://schemas.microsoft.com/office/drawing/2016/5/14/chartex" xmlns:mc="http://schemas.openxmlformats.org/markup-compatibility/2006" xmlns:m="http://schemas.openxmlformats.org/officeDocument/2006/math" xmlns:aink="http://schemas.microsoft.com/office/drawing/2016/ink" xmlns:am3d="http://schemas.microsoft.com/office/drawing/2017/model3d" xmlns:oel="http://schemas.microsoft.com/office/2019/extlst" xmlns:r="http://schemas.openxmlformats.org/officeDocument/2006/relationships" xmlns:wp14="http://schemas.microsoft.com/office/word/2010/wordprocessingDrawing" xmlns:wp="http://schemas.openxmlformats.org/drawingml/2006/wordprocessingDrawing" xmlns:wpg="http://schemas.microsoft.com/office/word/2010/wordprocessingGroup" xmlns:wpi="http://schemas.microsoft.com/office/word/2010/wordprocessingInk" xmlns:wps="http://schemas.microsoft.com/office/word/2010/wordprocessingShape" xmlns:o="urn:schemas-microsoft-com:office:office" xmlns:v="urn:schemas-microsoft-com:vml" xmlns:w10="urn:schemas-microsoft-com:office:word" xmlns:w="http://schemas.openxmlformats.org/wordprocessingml/2006/main" xmlns:w14="http://schemas.microsoft.com/office/word/2010/wordml" xmlns:w15="http://schemas.microsoft.com/office/word/2012/wordml" xmlns:w16cei="http://schemas.microsoft.com/office/word/2026/wordml/cei" xmlns:w16cex="http://schemas.microsoft.com/office/word/2018/wordml/cex" xmlns:w16cid="http://schemas.microsoft.com/office/word/2016/wordml/cid" xmlns:w16="http://schemas.microsoft.com/office/word/2018/wordml" xmlns:w16sdtdh="http://schemas.microsoft.com/office/word/2020/wordml/sdtdatahash" xmlns:w16sdtfl="http://schemas.microsoft.com/office/word/2024/wordml/sdtformatlock" xmlns:w16se="http://schemas.microsoft.com/office/word/2015/wordml/symex" xmlns:w16du="http://schemas.microsoft.com/office/word/2023/wordml/word16du" xmlns:wne="http://schemas.microsoft.com/office/word/2006/wordml" mc:Ignorable="w14 w15 w16se w16cid w16 w16cex w16sdtdh w16sdtfl w16du wp14">
   <w:abstractNum w:abstractNumId="0" w15:restartNumberingAfterBreak="0">
+    <w:nsid w:val="030924E8"/>
+    <w:multiLevelType w:val="multilevel"/>
+    <w:tmpl w:val="2444BAB0"/>
+    <w:lvl w:ilvl="0">
+      <w:start w:val="1"/>
+      <w:numFmt w:val="bullet"/>
+      <w:lvlText w:val=""/>
+      <w:lvlJc w:val="left"/>
+      <w:pPr>
+        <w:tabs>
+          <w:tab w:val="num" w:pos="720"/>
+        </w:tabs>
+        <w:ind w:left="720" w:hanging="360"/>
+      </w:pPr>
+      <w:rPr>
+        <w:rFonts w:ascii="Symbol" w:hAnsi="Symbol" w:hint="default"/>
+        <w:sz w:val="20"/>
+      </w:rPr>
+    </w:lvl>
+    <w:lvl w:ilvl="1" w:tentative="1">
+      <w:start w:val="1"/>
+      <w:numFmt w:val="bullet"/>
+      <w:lvlText w:val="o"/>
+      <w:lvlJc w:val="left"/>
+      <w:pPr>
+        <w:tabs>
+          <w:tab w:val="num" w:pos="1440"/>
+        </w:tabs>
+        <w:ind w:left="1440" w:hanging="360"/>
+      </w:pPr>
+      <w:rPr>
+        <w:rFonts w:ascii="Courier New" w:hAnsi="Courier New" w:hint="default"/>
+        <w:sz w:val="20"/>
+      </w:rPr>
+    </w:lvl>
+    <w:lvl w:ilvl="2" w:tentative="1">
+      <w:start w:val="1"/>
+      <w:numFmt w:val="bullet"/>
+      <w:lvlText w:val=""/>
+      <w:lvlJc w:val="left"/>
+      <w:pPr>
+        <w:tabs>
+          <w:tab w:val="num" w:pos="2160"/>
+        </w:tabs>
+        <w:ind w:left="2160" w:hanging="360"/>
+      </w:pPr>
+      <w:rPr>
+        <w:rFonts w:ascii="Wingdings" w:hAnsi="Wingdings" w:hint="default"/>
+        <w:sz w:val="20"/>
+      </w:rPr>
+    </w:lvl>
+    <w:lvl w:ilvl="3" w:tentative="1">
+      <w:start w:val="1"/>
+      <w:numFmt w:val="bullet"/>
+      <w:lvlText w:val=""/>
+      <w:lvlJc w:val="left"/>
+      <w:pPr>
+        <w:tabs>
+          <w:tab w:val="num" w:pos="2880"/>
+        </w:tabs>
+        <w:ind w:left="2880" w:hanging="360"/>
+      </w:pPr>
+      <w:rPr>
+        <w:rFonts w:ascii="Wingdings" w:hAnsi="Wingdings" w:hint="default"/>
+        <w:sz w:val="20"/>
+      </w:rPr>
+    </w:lvl>
+    <w:lvl w:ilvl="4" w:tentative="1">
+      <w:start w:val="1"/>
+      <w:numFmt w:val="bullet"/>
+      <w:lvlText w:val=""/>
+      <w:lvlJc w:val="left"/>
+      <w:pPr>
+        <w:tabs>
+          <w:tab w:val="num" w:pos="3600"/>
+        </w:tabs>
+        <w:ind w:left="3600" w:hanging="360"/>
+      </w:pPr>
+      <w:rPr>
+        <w:rFonts w:ascii="Wingdings" w:hAnsi="Wingdings" w:hint="default"/>
+        <w:sz w:val="20"/>
+      </w:rPr>
+    </w:lvl>
+    <w:lvl w:ilvl="5" w:tentative="1">
+      <w:start w:val="1"/>
+      <w:numFmt w:val="bullet"/>
+      <w:lvlText w:val=""/>
+      <w:lvlJc w:val="left"/>
+      <w:pPr>
+        <w:tabs>
+          <w:tab w:val="num" w:pos="4320"/>
+        </w:tabs>
+        <w:ind w:left="4320" w:hanging="360"/>
+      </w:pPr>
+      <w:rPr>
+        <w:rFonts w:ascii="Wingdings" w:hAnsi="Wingdings" w:hint="default"/>
+        <w:sz w:val="20"/>
+      </w:rPr>
+    </w:lvl>
+    <w:lvl w:ilvl="6" w:tentative="1">
+      <w:start w:val="1"/>
+      <w:numFmt w:val="bullet"/>
+      <w:lvlText w:val=""/>
+      <w:lvlJc w:val="left"/>
+      <w:pPr>
+        <w:tabs>
+          <w:tab w:val="num" w:pos="5040"/>
+        </w:tabs>
+        <w:ind w:left="5040" w:hanging="360"/>
+      </w:pPr>
+      <w:rPr>
+        <w:rFonts w:ascii="Wingdings" w:hAnsi="Wingdings" w:hint="default"/>
+        <w:sz w:val="20"/>
+      </w:rPr>
+    </w:lvl>
+    <w:lvl w:ilvl="7" w:tentative="1">
+      <w:start w:val="1"/>
+      <w:numFmt w:val="bullet"/>
+      <w:lvlText w:val=""/>
+      <w:lvlJc w:val="left"/>
+      <w:pPr>
+        <w:tabs>
+          <w:tab w:val="num" w:pos="5760"/>
+        </w:tabs>
+        <w:ind w:left="5760" w:hanging="360"/>
+      </w:pPr>
+      <w:rPr>
+        <w:rFonts w:ascii="Wingdings" w:hAnsi="Wingdings" w:hint="default"/>
+        <w:sz w:val="20"/>
+      </w:rPr>
+    </w:lvl>
+    <w:lvl w:ilvl="8" w:tentative="1">
+      <w:start w:val="1"/>
+      <w:numFmt w:val="bullet"/>
+      <w:lvlText w:val=""/>
+      <w:lvlJc w:val="left"/>
+      <w:pPr>
+        <w:tabs>
+          <w:tab w:val="num" w:pos="6480"/>
+        </w:tabs>
+        <w:ind w:left="6480" w:hanging="360"/>
+      </w:pPr>
+      <w:rPr>
+        <w:rFonts w:ascii="Wingdings" w:hAnsi="Wingdings" w:hint="default"/>
+        <w:sz w:val="20"/>
+      </w:rPr>
+    </w:lvl>
+  </w:abstractNum>
+  <w:abstractNum w:abstractNumId="1" w15:restartNumberingAfterBreak="0">
+    <w:nsid w:val="225D0F3F"/>
+    <w:multiLevelType w:val="multilevel"/>
+    <w:tmpl w:val="3A24C06E"/>
+    <w:lvl w:ilvl="0">
+      <w:start w:val="1"/>
+      <w:numFmt w:val="bullet"/>
+      <w:lvlText w:val=""/>
+      <w:lvlJc w:val="left"/>
+      <w:pPr>
+        <w:tabs>
+          <w:tab w:val="num" w:pos="720"/>
+        </w:tabs>
+        <w:ind w:left="720" w:hanging="360"/>
+      </w:pPr>
+      <w:rPr>
+        <w:rFonts w:ascii="Symbol" w:hAnsi="Symbol" w:hint="default"/>
+        <w:sz w:val="20"/>
+      </w:rPr>
+    </w:lvl>
+    <w:lvl w:ilvl="1" w:tentative="1">
+      <w:start w:val="1"/>
+      <w:numFmt w:val="bullet"/>
+      <w:lvlText w:val="o"/>
+      <w:lvlJc w:val="left"/>
+      <w:pPr>
+        <w:tabs>
+          <w:tab w:val="num" w:pos="1440"/>
+        </w:tabs>
+        <w:ind w:left="1440" w:hanging="360"/>
+      </w:pPr>
+      <w:rPr>
+        <w:rFonts w:ascii="Courier New" w:hAnsi="Courier New" w:hint="default"/>
+        <w:sz w:val="20"/>
+      </w:rPr>
+    </w:lvl>
+    <w:lvl w:ilvl="2" w:tentative="1">
+      <w:start w:val="1"/>
+      <w:numFmt w:val="bullet"/>
+      <w:lvlText w:val=""/>
+      <w:lvlJc w:val="left"/>
+      <w:pPr>
+        <w:tabs>
+          <w:tab w:val="num" w:pos="2160"/>
+        </w:tabs>
+        <w:ind w:left="2160" w:hanging="360"/>
+      </w:pPr>
+      <w:rPr>
+        <w:rFonts w:ascii="Wingdings" w:hAnsi="Wingdings" w:hint="default"/>
+        <w:sz w:val="20"/>
+      </w:rPr>
+    </w:lvl>
+    <w:lvl w:ilvl="3" w:tentative="1">
+      <w:start w:val="1"/>
+      <w:numFmt w:val="bullet"/>
+      <w:lvlText w:val=""/>
+      <w:lvlJc w:val="left"/>
+      <w:pPr>
+        <w:tabs>
+          <w:tab w:val="num" w:pos="2880"/>
+        </w:tabs>
+        <w:ind w:left="2880" w:hanging="360"/>
+      </w:pPr>
+      <w:rPr>
+        <w:rFonts w:ascii="Wingdings" w:hAnsi="Wingdings" w:hint="default"/>
+        <w:sz w:val="20"/>
+      </w:rPr>
+    </w:lvl>
+    <w:lvl w:ilvl="4" w:tentative="1">
+      <w:start w:val="1"/>
+      <w:numFmt w:val="bullet"/>
+      <w:lvlText w:val=""/>
+      <w:lvlJc w:val="left"/>
+      <w:pPr>
+        <w:tabs>
+          <w:tab w:val="num" w:pos="3600"/>
+        </w:tabs>
+        <w:ind w:left="3600" w:hanging="360"/>
+      </w:pPr>
+      <w:rPr>
+        <w:rFonts w:ascii="Wingdings" w:hAnsi="Wingdings" w:hint="default"/>
+        <w:sz w:val="20"/>
+      </w:rPr>
+    </w:lvl>
+    <w:lvl w:ilvl="5" w:tentative="1">
+      <w:start w:val="1"/>
+      <w:numFmt w:val="bullet"/>
+      <w:lvlText w:val=""/>
+      <w:lvlJc w:val="left"/>
+      <w:pPr>
+        <w:tabs>
+          <w:tab w:val="num" w:pos="4320"/>
+        </w:tabs>
+        <w:ind w:left="4320" w:hanging="360"/>
+      </w:pPr>
+      <w:rPr>
+        <w:rFonts w:ascii="Wingdings" w:hAnsi="Wingdings" w:hint="default"/>
+        <w:sz w:val="20"/>
+      </w:rPr>
+    </w:lvl>
+    <w:lvl w:ilvl="6" w:tentative="1">
+      <w:start w:val="1"/>
+      <w:numFmt w:val="bullet"/>
+      <w:lvlText w:val=""/>
+      <w:lvlJc w:val="left"/>
+      <w:pPr>
+        <w:tabs>
+          <w:tab w:val="num" w:pos="5040"/>
+        </w:tabs>
+        <w:ind w:left="5040" w:hanging="360"/>
+      </w:pPr>
+      <w:rPr>
+        <w:rFonts w:ascii="Wingdings" w:hAnsi="Wingdings" w:hint="default"/>
+        <w:sz w:val="20"/>
+      </w:rPr>
+    </w:lvl>
+    <w:lvl w:ilvl="7" w:tentative="1">
+      <w:start w:val="1"/>
+      <w:numFmt w:val="bullet"/>
+      <w:lvlText w:val=""/>
+      <w:lvlJc w:val="left"/>
+      <w:pPr>
+        <w:tabs>
+          <w:tab w:val="num" w:pos="5760"/>
+        </w:tabs>
+        <w:ind w:left="5760" w:hanging="360"/>
+      </w:pPr>
+      <w:rPr>
+        <w:rFonts w:ascii="Wingdings" w:hAnsi="Wingdings" w:hint="default"/>
+        <w:sz w:val="20"/>
+      </w:rPr>
+    </w:lvl>
+    <w:lvl w:ilvl="8" w:tentative="1">
+      <w:start w:val="1"/>
+      <w:numFmt w:val="bullet"/>
+      <w:lvlText w:val=""/>
+      <w:lvlJc w:val="left"/>
+      <w:pPr>
+        <w:tabs>
+          <w:tab w:val="num" w:pos="6480"/>
+        </w:tabs>
+        <w:ind w:left="6480" w:hanging="360"/>
+      </w:pPr>
+      <w:rPr>
+        <w:rFonts w:ascii="Wingdings" w:hAnsi="Wingdings" w:hint="default"/>
+        <w:sz w:val="20"/>
+      </w:rPr>
+    </w:lvl>
+  </w:abstractNum>
+  <w:abstractNum w:abstractNumId="2" w15:restartNumberingAfterBreak="0">
+    <w:nsid w:val="275470B9"/>
+    <w:multiLevelType w:val="multilevel"/>
+    <w:tmpl w:val="77B60BA6"/>
+    <w:lvl w:ilvl="0">
+      <w:start w:val="1"/>
+      <w:numFmt w:val="bullet"/>
+      <w:lvlText w:val=""/>
+      <w:lvlJc w:val="left"/>
+      <w:pPr>
+        <w:tabs>
+          <w:tab w:val="num" w:pos="720"/>
+        </w:tabs>
+        <w:ind w:left="720" w:hanging="360"/>
+      </w:pPr>
+      <w:rPr>
+        <w:rFonts w:ascii="Symbol" w:hAnsi="Symbol" w:hint="default"/>
+        <w:sz w:val="20"/>
+      </w:rPr>
+    </w:lvl>
+    <w:lvl w:ilvl="1" w:tentative="1">
+      <w:start w:val="1"/>
+      <w:numFmt w:val="bullet"/>
+      <w:lvlText w:val="o"/>
+      <w:lvlJc w:val="left"/>
+      <w:pPr>
+        <w:tabs>
+          <w:tab w:val="num" w:pos="1440"/>
+        </w:tabs>
+        <w:ind w:left="1440" w:hanging="360"/>
+      </w:pPr>
+      <w:rPr>
+        <w:rFonts w:ascii="Courier New" w:hAnsi="Courier New" w:hint="default"/>
+        <w:sz w:val="20"/>
+      </w:rPr>
+    </w:lvl>
+    <w:lvl w:ilvl="2" w:tentative="1">
+      <w:start w:val="1"/>
+      <w:numFmt w:val="bullet"/>
+      <w:lvlText w:val=""/>
+      <w:lvlJc w:val="left"/>
+      <w:pPr>
+        <w:tabs>
+          <w:tab w:val="num" w:pos="2160"/>
+        </w:tabs>
+        <w:ind w:left="2160" w:hanging="360"/>
+      </w:pPr>
+      <w:rPr>
+        <w:rFonts w:ascii="Wingdings" w:hAnsi="Wingdings" w:hint="default"/>
+        <w:sz w:val="20"/>
+      </w:rPr>
+    </w:lvl>
+    <w:lvl w:ilvl="3" w:tentative="1">
+      <w:start w:val="1"/>
+      <w:numFmt w:val="bullet"/>
+      <w:lvlText w:val=""/>
+      <w:lvlJc w:val="left"/>
+      <w:pPr>
+        <w:tabs>
+          <w:tab w:val="num" w:pos="2880"/>
+        </w:tabs>
+        <w:ind w:left="2880" w:hanging="360"/>
+      </w:pPr>
+      <w:rPr>
+        <w:rFonts w:ascii="Wingdings" w:hAnsi="Wingdings" w:hint="default"/>
+        <w:sz w:val="20"/>
+      </w:rPr>
+    </w:lvl>
+    <w:lvl w:ilvl="4" w:tentative="1">
+      <w:start w:val="1"/>
+      <w:numFmt w:val="bullet"/>
+      <w:lvlText w:val=""/>
+      <w:lvlJc w:val="left"/>
+      <w:pPr>
+        <w:tabs>
+          <w:tab w:val="num" w:pos="3600"/>
+        </w:tabs>
+        <w:ind w:left="3600" w:hanging="360"/>
+      </w:pPr>
+      <w:rPr>
+        <w:rFonts w:ascii="Wingdings" w:hAnsi="Wingdings" w:hint="default"/>
+        <w:sz w:val="20"/>
+      </w:rPr>
+    </w:lvl>
+    <w:lvl w:ilvl="5" w:tentative="1">
+      <w:start w:val="1"/>
+      <w:numFmt w:val="bullet"/>
+      <w:lvlText w:val=""/>
+      <w:lvlJc w:val="left"/>
+      <w:pPr>
+        <w:tabs>
+          <w:tab w:val="num" w:pos="4320"/>
+        </w:tabs>
+        <w:ind w:left="4320" w:hanging="360"/>
+      </w:pPr>
+      <w:rPr>
+        <w:rFonts w:ascii="Wingdings" w:hAnsi="Wingdings" w:hint="default"/>
+        <w:sz w:val="20"/>
+      </w:rPr>
+    </w:lvl>
+    <w:lvl w:ilvl="6" w:tentative="1">
+      <w:start w:val="1"/>
+      <w:numFmt w:val="bullet"/>
+      <w:lvlText w:val=""/>
+      <w:lvlJc w:val="left"/>
+      <w:pPr>
+        <w:tabs>
+          <w:tab w:val="num" w:pos="5040"/>
+        </w:tabs>
+        <w:ind w:left="5040" w:hanging="360"/>
+      </w:pPr>
+      <w:rPr>
+        <w:rFonts w:ascii="Wingdings" w:hAnsi="Wingdings" w:hint="default"/>
+        <w:sz w:val="20"/>
+      </w:rPr>
+    </w:lvl>
+    <w:lvl w:ilvl="7" w:tentative="1">
+      <w:start w:val="1"/>
+      <w:numFmt w:val="bullet"/>
+      <w:lvlText w:val=""/>
+      <w:lvlJc w:val="left"/>
+      <w:pPr>
+        <w:tabs>
+          <w:tab w:val="num" w:pos="5760"/>
+        </w:tabs>
+        <w:ind w:left="5760" w:hanging="360"/>
+      </w:pPr>
+      <w:rPr>
+        <w:rFonts w:ascii="Wingdings" w:hAnsi="Wingdings" w:hint="default"/>
+        <w:sz w:val="20"/>
+      </w:rPr>
+    </w:lvl>
+    <w:lvl w:ilvl="8" w:tentative="1">
+      <w:start w:val="1"/>
+      <w:numFmt w:val="bullet"/>
+      <w:lvlText w:val=""/>
+      <w:lvlJc w:val="left"/>
+      <w:pPr>
+        <w:tabs>
+          <w:tab w:val="num" w:pos="6480"/>
+        </w:tabs>
+        <w:ind w:left="6480" w:hanging="360"/>
+      </w:pPr>
+      <w:rPr>
+        <w:rFonts w:ascii="Wingdings" w:hAnsi="Wingdings" w:hint="default"/>
+        <w:sz w:val="20"/>
+      </w:rPr>
+    </w:lvl>
+  </w:abstractNum>
+  <w:abstractNum w:abstractNumId="3" w15:restartNumberingAfterBreak="0">
+    <w:nsid w:val="57ED5FF1"/>
+    <w:multiLevelType w:val="multilevel"/>
+    <w:tmpl w:val="CEF653A4"/>
+    <w:lvl w:ilvl="0">
+      <w:start w:val="1"/>
+      <w:numFmt w:val="bullet"/>
+      <w:lvlText w:val=""/>
+      <w:lvlJc w:val="left"/>
+      <w:pPr>
+        <w:tabs>
+          <w:tab w:val="num" w:pos="720"/>
+        </w:tabs>
+        <w:ind w:left="720" w:hanging="360"/>
+      </w:pPr>
+      <w:rPr>
+        <w:rFonts w:ascii="Symbol" w:hAnsi="Symbol" w:hint="default"/>
+        <w:sz w:val="20"/>
+      </w:rPr>
+    </w:lvl>
+    <w:lvl w:ilvl="1" w:tentative="1">
+      <w:start w:val="1"/>
+      <w:numFmt w:val="bullet"/>
+      <w:lvlText w:val="o"/>
+      <w:lvlJc w:val="left"/>
+      <w:pPr>
+        <w:tabs>
+          <w:tab w:val="num" w:pos="1440"/>
+        </w:tabs>
+        <w:ind w:left="1440" w:hanging="360"/>
+      </w:pPr>
+      <w:rPr>
+        <w:rFonts w:ascii="Courier New" w:hAnsi="Courier New" w:hint="default"/>
+        <w:sz w:val="20"/>
+      </w:rPr>
+    </w:lvl>
+    <w:lvl w:ilvl="2" w:tentative="1">
+      <w:start w:val="1"/>
+      <w:numFmt w:val="bullet"/>
+      <w:lvlText w:val=""/>
+      <w:lvlJc w:val="left"/>
+      <w:pPr>
+        <w:tabs>
+          <w:tab w:val="num" w:pos="2160"/>
+        </w:tabs>
+        <w:ind w:left="2160" w:hanging="360"/>
+      </w:pPr>
+      <w:rPr>
+        <w:rFonts w:ascii="Wingdings" w:hAnsi="Wingdings" w:hint="default"/>
+        <w:sz w:val="20"/>
+      </w:rPr>
+    </w:lvl>
+    <w:lvl w:ilvl="3" w:tentative="1">
+      <w:start w:val="1"/>
+      <w:numFmt w:val="bullet"/>
+      <w:lvlText w:val=""/>
+      <w:lvlJc w:val="left"/>
+      <w:pPr>
+        <w:tabs>
+          <w:tab w:val="num" w:pos="2880"/>
+        </w:tabs>
+        <w:ind w:left="2880" w:hanging="360"/>
+      </w:pPr>
+      <w:rPr>
+        <w:rFonts w:ascii="Wingdings" w:hAnsi="Wingdings" w:hint="default"/>
+        <w:sz w:val="20"/>
+      </w:rPr>
+    </w:lvl>
+    <w:lvl w:ilvl="4" w:tentative="1">
+      <w:start w:val="1"/>
+      <w:numFmt w:val="bullet"/>
+      <w:lvlText w:val=""/>
+      <w:lvlJc w:val="left"/>
+      <w:pPr>
+        <w:tabs>
+          <w:tab w:val="num" w:pos="3600"/>
+        </w:tabs>
+        <w:ind w:left="3600" w:hanging="360"/>
+      </w:pPr>
+      <w:rPr>
+        <w:rFonts w:ascii="Wingdings" w:hAnsi="Wingdings" w:hint="default"/>
+        <w:sz w:val="20"/>
+      </w:rPr>
+    </w:lvl>
+    <w:lvl w:ilvl="5" w:tentative="1">
+      <w:start w:val="1"/>
+      <w:numFmt w:val="bullet"/>
+      <w:lvlText w:val=""/>
+      <w:lvlJc w:val="left"/>
+      <w:pPr>
+        <w:tabs>
+          <w:tab w:val="num" w:pos="4320"/>
+        </w:tabs>
+        <w:ind w:left="4320" w:hanging="360"/>
+      </w:pPr>
+      <w:rPr>
+        <w:rFonts w:ascii="Wingdings" w:hAnsi="Wingdings" w:hint="default"/>
+        <w:sz w:val="20"/>
+      </w:rPr>
+    </w:lvl>
+    <w:lvl w:ilvl="6" w:tentative="1">
+      <w:start w:val="1"/>
+      <w:numFmt w:val="bullet"/>
+      <w:lvlText w:val=""/>
+      <w:lvlJc w:val="left"/>
+      <w:pPr>
+        <w:tabs>
+          <w:tab w:val="num" w:pos="5040"/>
+        </w:tabs>
+        <w:ind w:left="5040" w:hanging="360"/>
+      </w:pPr>
+      <w:rPr>
+        <w:rFonts w:ascii="Wingdings" w:hAnsi="Wingdings" w:hint="default"/>
+        <w:sz w:val="20"/>
+      </w:rPr>
+    </w:lvl>
+    <w:lvl w:ilvl="7" w:tentative="1">
+      <w:start w:val="1"/>
+      <w:numFmt w:val="bullet"/>
+      <w:lvlText w:val=""/>
+      <w:lvlJc w:val="left"/>
+      <w:pPr>
+        <w:tabs>
+          <w:tab w:val="num" w:pos="5760"/>
+        </w:tabs>
+        <w:ind w:left="5760" w:hanging="360"/>
+      </w:pPr>
+      <w:rPr>
+        <w:rFonts w:ascii="Wingdings" w:hAnsi="Wingdings" w:hint="default"/>
+        <w:sz w:val="20"/>
+      </w:rPr>
+    </w:lvl>
+    <w:lvl w:ilvl="8" w:tentative="1">
+      <w:start w:val="1"/>
+      <w:numFmt w:val="bullet"/>
+      <w:lvlText w:val=""/>
+      <w:lvlJc w:val="left"/>
+      <w:pPr>
+        <w:tabs>
+          <w:tab w:val="num" w:pos="6480"/>
+        </w:tabs>
+        <w:ind w:left="6480" w:hanging="360"/>
+      </w:pPr>
+      <w:rPr>
+        <w:rFonts w:ascii="Wingdings" w:hAnsi="Wingdings" w:hint="default"/>
+        <w:sz w:val="20"/>
+      </w:rPr>
+    </w:lvl>
+  </w:abstractNum>
+  <w:abstractNum w:abstractNumId="4" w15:restartNumberingAfterBreak="0">
     <w:nsid w:val="5A3E4844"/>
     <w:multiLevelType w:val="multilevel"/>
     <w:tmpl w:val="16EA92F4"/>
@@ -1656,8 +5519,404 @@
       </w:pPr>
     </w:lvl>
   </w:abstractNum>
+  <w:abstractNum w:abstractNumId="5" w15:restartNumberingAfterBreak="0">
+    <w:nsid w:val="627B4DE9"/>
+    <w:multiLevelType w:val="multilevel"/>
+    <w:tmpl w:val="5956CC2A"/>
+    <w:lvl w:ilvl="0">
+      <w:start w:val="1"/>
+      <w:numFmt w:val="decimal"/>
+      <w:lvlText w:val="%1."/>
+      <w:lvlJc w:val="left"/>
+      <w:pPr>
+        <w:tabs>
+          <w:tab w:val="num" w:pos="720"/>
+        </w:tabs>
+        <w:ind w:left="720" w:hanging="360"/>
+      </w:pPr>
+    </w:lvl>
+    <w:lvl w:ilvl="1" w:tentative="1">
+      <w:start w:val="1"/>
+      <w:numFmt w:val="decimal"/>
+      <w:lvlText w:val="%2."/>
+      <w:lvlJc w:val="left"/>
+      <w:pPr>
+        <w:tabs>
+          <w:tab w:val="num" w:pos="1440"/>
+        </w:tabs>
+        <w:ind w:left="1440" w:hanging="360"/>
+      </w:pPr>
+    </w:lvl>
+    <w:lvl w:ilvl="2" w:tentative="1">
+      <w:start w:val="1"/>
+      <w:numFmt w:val="decimal"/>
+      <w:lvlText w:val="%3."/>
+      <w:lvlJc w:val="left"/>
+      <w:pPr>
+        <w:tabs>
+          <w:tab w:val="num" w:pos="2160"/>
+        </w:tabs>
+        <w:ind w:left="2160" w:hanging="360"/>
+      </w:pPr>
+    </w:lvl>
+    <w:lvl w:ilvl="3" w:tentative="1">
+      <w:start w:val="1"/>
+      <w:numFmt w:val="decimal"/>
+      <w:lvlText w:val="%4."/>
+      <w:lvlJc w:val="left"/>
+      <w:pPr>
+        <w:tabs>
+          <w:tab w:val="num" w:pos="2880"/>
+        </w:tabs>
+        <w:ind w:left="2880" w:hanging="360"/>
+      </w:pPr>
+    </w:lvl>
+    <w:lvl w:ilvl="4" w:tentative="1">
+      <w:start w:val="1"/>
+      <w:numFmt w:val="decimal"/>
+      <w:lvlText w:val="%5."/>
+      <w:lvlJc w:val="left"/>
+      <w:pPr>
+        <w:tabs>
+          <w:tab w:val="num" w:pos="3600"/>
+        </w:tabs>
+        <w:ind w:left="3600" w:hanging="360"/>
+      </w:pPr>
+    </w:lvl>
+    <w:lvl w:ilvl="5" w:tentative="1">
+      <w:start w:val="1"/>
+      <w:numFmt w:val="decimal"/>
+      <w:lvlText w:val="%6."/>
+      <w:lvlJc w:val="left"/>
+      <w:pPr>
+        <w:tabs>
+          <w:tab w:val="num" w:pos="4320"/>
+        </w:tabs>
+        <w:ind w:left="4320" w:hanging="360"/>
+      </w:pPr>
+    </w:lvl>
+    <w:lvl w:ilvl="6" w:tentative="1">
+      <w:start w:val="1"/>
+      <w:numFmt w:val="decimal"/>
+      <w:lvlText w:val="%7."/>
+      <w:lvlJc w:val="left"/>
+      <w:pPr>
+        <w:tabs>
+          <w:tab w:val="num" w:pos="5040"/>
+        </w:tabs>
+        <w:ind w:left="5040" w:hanging="360"/>
+      </w:pPr>
+    </w:lvl>
+    <w:lvl w:ilvl="7" w:tentative="1">
+      <w:start w:val="1"/>
+      <w:numFmt w:val="decimal"/>
+      <w:lvlText w:val="%8."/>
+      <w:lvlJc w:val="left"/>
+      <w:pPr>
+        <w:tabs>
+          <w:tab w:val="num" w:pos="5760"/>
+        </w:tabs>
+        <w:ind w:left="5760" w:hanging="360"/>
+      </w:pPr>
+    </w:lvl>
+    <w:lvl w:ilvl="8" w:tentative="1">
+      <w:start w:val="1"/>
+      <w:numFmt w:val="decimal"/>
+      <w:lvlText w:val="%9."/>
+      <w:lvlJc w:val="left"/>
+      <w:pPr>
+        <w:tabs>
+          <w:tab w:val="num" w:pos="6480"/>
+        </w:tabs>
+        <w:ind w:left="6480" w:hanging="360"/>
+      </w:pPr>
+    </w:lvl>
+  </w:abstractNum>
+  <w:abstractNum w:abstractNumId="6" w15:restartNumberingAfterBreak="0">
+    <w:nsid w:val="7E8C17CC"/>
+    <w:multiLevelType w:val="multilevel"/>
+    <w:tmpl w:val="206ACD14"/>
+    <w:lvl w:ilvl="0">
+      <w:start w:val="1"/>
+      <w:numFmt w:val="decimal"/>
+      <w:lvlText w:val="%1."/>
+      <w:lvlJc w:val="left"/>
+      <w:pPr>
+        <w:tabs>
+          <w:tab w:val="num" w:pos="720"/>
+        </w:tabs>
+        <w:ind w:left="720" w:hanging="360"/>
+      </w:pPr>
+    </w:lvl>
+    <w:lvl w:ilvl="1" w:tentative="1">
+      <w:start w:val="1"/>
+      <w:numFmt w:val="decimal"/>
+      <w:lvlText w:val="%2."/>
+      <w:lvlJc w:val="left"/>
+      <w:pPr>
+        <w:tabs>
+          <w:tab w:val="num" w:pos="1440"/>
+        </w:tabs>
+        <w:ind w:left="1440" w:hanging="360"/>
+      </w:pPr>
+    </w:lvl>
+    <w:lvl w:ilvl="2" w:tentative="1">
+      <w:start w:val="1"/>
+      <w:numFmt w:val="decimal"/>
+      <w:lvlText w:val="%3."/>
+      <w:lvlJc w:val="left"/>
+      <w:pPr>
+        <w:tabs>
+          <w:tab w:val="num" w:pos="2160"/>
+        </w:tabs>
+        <w:ind w:left="2160" w:hanging="360"/>
+      </w:pPr>
+    </w:lvl>
+    <w:lvl w:ilvl="3" w:tentative="1">
+      <w:start w:val="1"/>
+      <w:numFmt w:val="decimal"/>
+      <w:lvlText w:val="%4."/>
+      <w:lvlJc w:val="left"/>
+      <w:pPr>
+        <w:tabs>
+          <w:tab w:val="num" w:pos="2880"/>
+        </w:tabs>
+        <w:ind w:left="2880" w:hanging="360"/>
+      </w:pPr>
+    </w:lvl>
+    <w:lvl w:ilvl="4" w:tentative="1">
+      <w:start w:val="1"/>
+      <w:numFmt w:val="decimal"/>
+      <w:lvlText w:val="%5."/>
+      <w:lvlJc w:val="left"/>
+      <w:pPr>
+        <w:tabs>
+          <w:tab w:val="num" w:pos="3600"/>
+        </w:tabs>
+        <w:ind w:left="3600" w:hanging="360"/>
+      </w:pPr>
+    </w:lvl>
+    <w:lvl w:ilvl="5" w:tentative="1">
+      <w:start w:val="1"/>
+      <w:numFmt w:val="decimal"/>
+      <w:lvlText w:val="%6."/>
+      <w:lvlJc w:val="left"/>
+      <w:pPr>
+        <w:tabs>
+          <w:tab w:val="num" w:pos="4320"/>
+        </w:tabs>
+        <w:ind w:left="4320" w:hanging="360"/>
+      </w:pPr>
+    </w:lvl>
+    <w:lvl w:ilvl="6" w:tentative="1">
+      <w:start w:val="1"/>
+      <w:numFmt w:val="decimal"/>
+      <w:lvlText w:val="%7."/>
+      <w:lvlJc w:val="left"/>
+      <w:pPr>
+        <w:tabs>
+          <w:tab w:val="num" w:pos="5040"/>
+        </w:tabs>
+        <w:ind w:left="5040" w:hanging="360"/>
+      </w:pPr>
+    </w:lvl>
+    <w:lvl w:ilvl="7" w:tentative="1">
+      <w:start w:val="1"/>
+      <w:numFmt w:val="decimal"/>
+      <w:lvlText w:val="%8."/>
+      <w:lvlJc w:val="left"/>
+      <w:pPr>
+        <w:tabs>
+          <w:tab w:val="num" w:pos="5760"/>
+        </w:tabs>
+        <w:ind w:left="5760" w:hanging="360"/>
+      </w:pPr>
+    </w:lvl>
+    <w:lvl w:ilvl="8" w:tentative="1">
+      <w:start w:val="1"/>
+      <w:numFmt w:val="decimal"/>
+      <w:lvlText w:val="%9."/>
+      <w:lvlJc w:val="left"/>
+      <w:pPr>
+        <w:tabs>
+          <w:tab w:val="num" w:pos="6480"/>
+        </w:tabs>
+        <w:ind w:left="6480" w:hanging="360"/>
+      </w:pPr>
+    </w:lvl>
+  </w:abstractNum>
+  <w:abstractNum w:abstractNumId="7" w15:restartNumberingAfterBreak="0">
+    <w:nsid w:val="7F640620"/>
+    <w:multiLevelType w:val="multilevel"/>
+    <w:tmpl w:val="2ECA5EC4"/>
+    <w:lvl w:ilvl="0">
+      <w:start w:val="1"/>
+      <w:numFmt w:val="bullet"/>
+      <w:lvlText w:val=""/>
+      <w:lvlJc w:val="left"/>
+      <w:pPr>
+        <w:tabs>
+          <w:tab w:val="num" w:pos="720"/>
+        </w:tabs>
+        <w:ind w:left="720" w:hanging="360"/>
+      </w:pPr>
+      <w:rPr>
+        <w:rFonts w:ascii="Symbol" w:hAnsi="Symbol" w:hint="default"/>
+        <w:sz w:val="20"/>
+      </w:rPr>
+    </w:lvl>
+    <w:lvl w:ilvl="1" w:tentative="1">
+      <w:start w:val="1"/>
+      <w:numFmt w:val="bullet"/>
+      <w:lvlText w:val="o"/>
+      <w:lvlJc w:val="left"/>
+      <w:pPr>
+        <w:tabs>
+          <w:tab w:val="num" w:pos="1440"/>
+        </w:tabs>
+        <w:ind w:left="1440" w:hanging="360"/>
+      </w:pPr>
+      <w:rPr>
+        <w:rFonts w:ascii="Courier New" w:hAnsi="Courier New" w:hint="default"/>
+        <w:sz w:val="20"/>
+      </w:rPr>
+    </w:lvl>
+    <w:lvl w:ilvl="2" w:tentative="1">
+      <w:start w:val="1"/>
+      <w:numFmt w:val="bullet"/>
+      <w:lvlText w:val=""/>
+      <w:lvlJc w:val="left"/>
+      <w:pPr>
+        <w:tabs>
+          <w:tab w:val="num" w:pos="2160"/>
+        </w:tabs>
+        <w:ind w:left="2160" w:hanging="360"/>
+      </w:pPr>
+      <w:rPr>
+        <w:rFonts w:ascii="Wingdings" w:hAnsi="Wingdings" w:hint="default"/>
+        <w:sz w:val="20"/>
+      </w:rPr>
+    </w:lvl>
+    <w:lvl w:ilvl="3" w:tentative="1">
+      <w:start w:val="1"/>
+      <w:numFmt w:val="bullet"/>
+      <w:lvlText w:val=""/>
+      <w:lvlJc w:val="left"/>
+      <w:pPr>
+        <w:tabs>
+          <w:tab w:val="num" w:pos="2880"/>
+        </w:tabs>
+        <w:ind w:left="2880" w:hanging="360"/>
+      </w:pPr>
+      <w:rPr>
+        <w:rFonts w:ascii="Wingdings" w:hAnsi="Wingdings" w:hint="default"/>
+        <w:sz w:val="20"/>
+      </w:rPr>
+    </w:lvl>
+    <w:lvl w:ilvl="4" w:tentative="1">
+      <w:start w:val="1"/>
+      <w:numFmt w:val="bullet"/>
+      <w:lvlText w:val=""/>
+      <w:lvlJc w:val="left"/>
+      <w:pPr>
+        <w:tabs>
+          <w:tab w:val="num" w:pos="3600"/>
+        </w:tabs>
+        <w:ind w:left="3600" w:hanging="360"/>
+      </w:pPr>
+      <w:rPr>
+        <w:rFonts w:ascii="Wingdings" w:hAnsi="Wingdings" w:hint="default"/>
+        <w:sz w:val="20"/>
+      </w:rPr>
+    </w:lvl>
+    <w:lvl w:ilvl="5" w:tentative="1">
+      <w:start w:val="1"/>
+      <w:numFmt w:val="bullet"/>
+      <w:lvlText w:val=""/>
+      <w:lvlJc w:val="left"/>
+      <w:pPr>
+        <w:tabs>
+          <w:tab w:val="num" w:pos="4320"/>
+        </w:tabs>
+        <w:ind w:left="4320" w:hanging="360"/>
+      </w:pPr>
+      <w:rPr>
+        <w:rFonts w:ascii="Wingdings" w:hAnsi="Wingdings" w:hint="default"/>
+        <w:sz w:val="20"/>
+      </w:rPr>
+    </w:lvl>
+    <w:lvl w:ilvl="6" w:tentative="1">
+      <w:start w:val="1"/>
+      <w:numFmt w:val="bullet"/>
+      <w:lvlText w:val=""/>
+      <w:lvlJc w:val="left"/>
+      <w:pPr>
+        <w:tabs>
+          <w:tab w:val="num" w:pos="5040"/>
+        </w:tabs>
+        <w:ind w:left="5040" w:hanging="360"/>
+      </w:pPr>
+      <w:rPr>
+        <w:rFonts w:ascii="Wingdings" w:hAnsi="Wingdings" w:hint="default"/>
+        <w:sz w:val="20"/>
+      </w:rPr>
+    </w:lvl>
+    <w:lvl w:ilvl="7" w:tentative="1">
+      <w:start w:val="1"/>
+      <w:numFmt w:val="bullet"/>
+      <w:lvlText w:val=""/>
+      <w:lvlJc w:val="left"/>
+      <w:pPr>
+        <w:tabs>
+          <w:tab w:val="num" w:pos="5760"/>
+        </w:tabs>
+        <w:ind w:left="5760" w:hanging="360"/>
+      </w:pPr>
+      <w:rPr>
+        <w:rFonts w:ascii="Wingdings" w:hAnsi="Wingdings" w:hint="default"/>
+        <w:sz w:val="20"/>
+      </w:rPr>
+    </w:lvl>
+    <w:lvl w:ilvl="8" w:tentative="1">
+      <w:start w:val="1"/>
+      <w:numFmt w:val="bullet"/>
+      <w:lvlText w:val=""/>
+      <w:lvlJc w:val="left"/>
+      <w:pPr>
+        <w:tabs>
+          <w:tab w:val="num" w:pos="6480"/>
+        </w:tabs>
+        <w:ind w:left="6480" w:hanging="360"/>
+      </w:pPr>
+      <w:rPr>
+        <w:rFonts w:ascii="Wingdings" w:hAnsi="Wingdings" w:hint="default"/>
+        <w:sz w:val="20"/>
+      </w:rPr>
+    </w:lvl>
+  </w:abstractNum>
   <w:num w:numId="1" w16cid:durableId="341782853">
+    <w:abstractNumId w:val="4"/>
+  </w:num>
+  <w:num w:numId="2" w16cid:durableId="185292038">
+    <w:abstractNumId w:val="6"/>
+  </w:num>
+  <w:num w:numId="3" w16cid:durableId="845903228">
     <w:abstractNumId w:val="0"/>
+  </w:num>
+  <w:num w:numId="4" w16cid:durableId="189421228">
+    <w:abstractNumId w:val="3"/>
+  </w:num>
+  <w:num w:numId="5" w16cid:durableId="741027845">
+    <w:abstractNumId w:val="2"/>
+  </w:num>
+  <w:num w:numId="6" w16cid:durableId="2052606443">
+    <w:abstractNumId w:val="5"/>
+  </w:num>
+  <w:num w:numId="7" w16cid:durableId="261298731">
+    <w:abstractNumId w:val="7"/>
+  </w:num>
+  <w:num w:numId="8" w16cid:durableId="1665864142">
+    <w:abstractNumId w:val="1"/>
   </w:num>
 </w:numbering>
 </file>
@@ -2134,7 +6393,6 @@
     <w:next w:val="Normal"/>
     <w:link w:val="Heading4Char"/>
     <w:uiPriority w:val="9"/>
-    <w:semiHidden/>
     <w:unhideWhenUsed/>
     <w:qFormat/>
     <w:rsid w:val="000F644C"/>
@@ -2331,7 +6589,6 @@
     <w:basedOn w:val="DefaultParagraphFont"/>
     <w:link w:val="Heading4"/>
     <w:uiPriority w:val="9"/>
-    <w:semiHidden/>
     <w:rsid w:val="000F644C"/>
     <w:rPr>
       <w:rFonts w:eastAsiaTheme="majorEastAsia" w:cstheme="majorBidi"/>

</xml_diff>